<commit_message>
codebook refined to three dimensions
</commit_message>
<xml_diff>
--- a/__codebook_comments.docx
+++ b/__codebook_comments.docx
@@ -152,7 +152,61 @@
           <w:szCs w:val="22"/>
           <w:lang w:val="en-CH"/>
         </w:rPr>
-        <w:t>This codebook documents the coding scheme developed for manually labelling user comments. Classifying comments along the dimensions of valence and sensitivity allowed for a more nuanced analysis of the content participants chose to share. Table (X) presents the two dimensions, each accompanied by a definition and illustrative examples.</w:t>
+        <w:t>This codebook documents the coding scheme developed for manually labelling user comments. Classifying comments along the dimensions of valence</w:t>
+      </w:r>
+      <w:r>
+        <w:rPr>
+          <w:rFonts w:ascii="Times New Roman" w:hAnsi="Times New Roman" w:cs="Times New Roman"/>
+          <w:sz w:val="22"/>
+          <w:szCs w:val="22"/>
+          <w:lang w:val="en-CH"/>
+        </w:rPr>
+        <w:t xml:space="preserve">, </w:t>
+      </w:r>
+      <w:r>
+        <w:rPr>
+          <w:rFonts w:ascii="Times New Roman" w:hAnsi="Times New Roman" w:cs="Times New Roman"/>
+          <w:sz w:val="22"/>
+          <w:szCs w:val="22"/>
+          <w:lang w:val="en-CH"/>
+        </w:rPr>
+        <w:t>sensitivity</w:t>
+      </w:r>
+      <w:r>
+        <w:rPr>
+          <w:rFonts w:ascii="Times New Roman" w:hAnsi="Times New Roman" w:cs="Times New Roman"/>
+          <w:sz w:val="22"/>
+          <w:szCs w:val="22"/>
+          <w:lang w:val="en-CH"/>
+        </w:rPr>
+        <w:t xml:space="preserve"> and controversiality</w:t>
+      </w:r>
+      <w:r>
+        <w:rPr>
+          <w:rFonts w:ascii="Times New Roman" w:hAnsi="Times New Roman" w:cs="Times New Roman"/>
+          <w:sz w:val="22"/>
+          <w:szCs w:val="22"/>
+          <w:lang w:val="en-CH"/>
+        </w:rPr>
+        <w:t xml:space="preserve"> allowed for a more nuanced analysis of the content participants chose to share. Table (X) presents the </w:t>
+      </w:r>
+      <w:r>
+        <w:rPr>
+          <w:rFonts w:ascii="Times New Roman" w:hAnsi="Times New Roman" w:cs="Times New Roman"/>
+          <w:sz w:val="22"/>
+          <w:szCs w:val="22"/>
+          <w:lang w:val="en-CH"/>
+        </w:rPr>
+        <w:t>three</w:t>
+      </w:r>
+      <w:r>
+        <w:rPr>
+          <w:rFonts w:ascii="Times New Roman" w:hAnsi="Times New Roman" w:cs="Times New Roman"/>
+          <w:sz w:val="22"/>
+          <w:szCs w:val="22"/>
+          <w:lang w:val="en-CH"/>
+        </w:rPr>
+        <w:t xml:space="preserve"> dimensions, each accompanied by a definition and illustrative examples.</w:t>
       </w:r>
     </w:p>
     <w:p>
@@ -235,6 +289,61 @@
         </w:rPr>
         <w:t>, we categorised three categories: high (comment reveals personal experiences, emotions, or fears), moderate (comment reveals general opinions or attitudes linkable to the person), and not sensitive (comment is purely factual or impersonal).</w:t>
       </w:r>
+    </w:p>
+    <w:p>
+      <w:pPr>
+        <w:pBdr>
+          <w:bottom w:val="single" w:sz="6" w:space="1" w:color="auto"/>
+        </w:pBdr>
+        <w:rPr>
+          <w:rFonts w:ascii="Times New Roman" w:hAnsi="Times New Roman" w:cs="Times New Roman"/>
+          <w:sz w:val="22"/>
+          <w:szCs w:val="22"/>
+          <w:lang w:val="en-CH"/>
+        </w:rPr>
+      </w:pPr>
+      <w:r>
+        <w:rPr>
+          <w:rFonts w:ascii="Times New Roman" w:hAnsi="Times New Roman" w:cs="Times New Roman"/>
+          <w:sz w:val="22"/>
+          <w:szCs w:val="22"/>
+          <w:lang w:val="en-CH"/>
+        </w:rPr>
+        <w:t xml:space="preserve">For </w:t>
+      </w:r>
+      <w:r>
+        <w:rPr>
+          <w:rFonts w:ascii="Times New Roman" w:hAnsi="Times New Roman" w:cs="Times New Roman"/>
+          <w:b/>
+          <w:bCs/>
+          <w:sz w:val="22"/>
+          <w:szCs w:val="22"/>
+          <w:lang w:val="en-CH"/>
+        </w:rPr>
+        <w:t xml:space="preserve">controversiality, </w:t>
+      </w:r>
+      <w:r>
+        <w:rPr>
+          <w:rFonts w:ascii="Times New Roman" w:hAnsi="Times New Roman" w:cs="Times New Roman"/>
+          <w:sz w:val="22"/>
+          <w:szCs w:val="22"/>
+          <w:lang w:val="en-CH"/>
+        </w:rPr>
+        <w:t>we categorised three categories: high controversy (comment touches upon highly divisive political or social topics), moderate controversy (comment expresses a critical or opinionated stance without invoking divisive group identities), and not controversial (comment is factual, procedural, or broadly consensual).</w:t>
+      </w:r>
+    </w:p>
+    <w:p>
+      <w:pPr>
+        <w:pBdr>
+          <w:bottom w:val="single" w:sz="6" w:space="1" w:color="auto"/>
+        </w:pBdr>
+        <w:rPr>
+          <w:rFonts w:ascii="Times New Roman" w:hAnsi="Times New Roman" w:cs="Times New Roman"/>
+          <w:sz w:val="22"/>
+          <w:szCs w:val="22"/>
+          <w:lang w:val="en-CH"/>
+        </w:rPr>
+      </w:pPr>
     </w:p>
     <w:p>
       <w:pPr>
@@ -298,12 +407,6 @@
         <w:gridCol w:w="3516"/>
       </w:tblGrid>
       <w:tr>
-        <w:tblPrEx>
-          <w:tblCellMar>
-            <w:top w:w="0" w:type="dxa"/>
-            <w:bottom w:w="0" w:type="dxa"/>
-          </w:tblCellMar>
-        </w:tblPrEx>
         <w:tc>
           <w:tcPr>
             <w:tcW w:w="700" w:type="dxa"/>
@@ -454,12 +557,6 @@
         </w:tc>
       </w:tr>
       <w:tr>
-        <w:tblPrEx>
-          <w:tblCellMar>
-            <w:top w:w="0" w:type="dxa"/>
-            <w:bottom w:w="0" w:type="dxa"/>
-          </w:tblCellMar>
-        </w:tblPrEx>
         <w:tc>
           <w:tcPr>
             <w:tcW w:w="700" w:type="dxa"/>
@@ -595,17 +692,15 @@
                 <w:rFonts w:ascii="Times New Roman" w:hAnsi="Times New Roman" w:cs="Times New Roman"/>
                 <w:sz w:val="22"/>
                 <w:szCs w:val="22"/>
-                <w:lang w:val="de-CH"/>
-              </w:rPr>
-            </w:pPr>
-            <w:r>
-              <w:rPr>
-                <w:rFonts w:ascii="Times New Roman" w:eastAsia="Times New Roman" w:hAnsi="Times New Roman" w:cs="Times New Roman"/>
-                <w:sz w:val="22"/>
-                <w:szCs w:val="22"/>
-                <w:lang w:val="de-CH"/>
-              </w:rPr>
-              <w:t>„Die beste Bundeskanzlerin hat konkrete Massnahmen angeschoben.“</w:t>
+              </w:rPr>
+            </w:pPr>
+            <w:r>
+              <w:rPr>
+                <w:rFonts w:ascii="Times New Roman" w:eastAsia="Times New Roman" w:hAnsi="Times New Roman" w:cs="Times New Roman"/>
+                <w:sz w:val="22"/>
+                <w:szCs w:val="22"/>
+              </w:rPr>
+              <w:t>"The best Chancellor has initiated concrete measures."</w:t>
             </w:r>
           </w:p>
           <w:p>
@@ -621,17 +716,15 @@
                 <w:rFonts w:ascii="Times New Roman" w:hAnsi="Times New Roman" w:cs="Times New Roman"/>
                 <w:sz w:val="22"/>
                 <w:szCs w:val="22"/>
-                <w:lang w:val="de-CH"/>
-              </w:rPr>
-            </w:pPr>
-            <w:r>
-              <w:rPr>
-                <w:rFonts w:ascii="Times New Roman" w:eastAsia="Times New Roman" w:hAnsi="Times New Roman" w:cs="Times New Roman"/>
-                <w:sz w:val="22"/>
-                <w:szCs w:val="22"/>
-                <w:lang w:val="de-CH"/>
-              </w:rPr>
-              <w:t>„Ich finde den 9-Punkte-Plan sinnvoll, um die Bevölkerung mehr zu schützen.“</w:t>
+              </w:rPr>
+            </w:pPr>
+            <w:r>
+              <w:rPr>
+                <w:rFonts w:ascii="Times New Roman" w:eastAsia="Times New Roman" w:hAnsi="Times New Roman" w:cs="Times New Roman"/>
+                <w:sz w:val="22"/>
+                <w:szCs w:val="22"/>
+              </w:rPr>
+              <w:t>"I find the 9-point plan sensible for better protecting the population."</w:t>
             </w:r>
           </w:p>
           <w:p>
@@ -647,28 +740,20 @@
                 <w:rFonts w:ascii="Times New Roman" w:hAnsi="Times New Roman" w:cs="Times New Roman"/>
                 <w:sz w:val="22"/>
                 <w:szCs w:val="22"/>
-                <w:lang w:val="de-CH"/>
-              </w:rPr>
-            </w:pPr>
-            <w:r>
-              <w:rPr>
-                <w:rFonts w:ascii="Times New Roman" w:eastAsia="Times New Roman" w:hAnsi="Times New Roman" w:cs="Times New Roman"/>
-                <w:sz w:val="22"/>
-                <w:szCs w:val="22"/>
-                <w:lang w:val="de-CH"/>
-              </w:rPr>
-              <w:t>„Es ist ein guter Anfang! Potenzielle Gefährder müssen ohne Umschweife ausgewiesen werden.“</w:t>
+              </w:rPr>
+            </w:pPr>
+            <w:r>
+              <w:rPr>
+                <w:rFonts w:ascii="Times New Roman" w:eastAsia="Times New Roman" w:hAnsi="Times New Roman" w:cs="Times New Roman"/>
+                <w:sz w:val="22"/>
+                <w:szCs w:val="22"/>
+              </w:rPr>
+              <w:t>"It is a good start! Potential threats must be expelled without detours."</w:t>
             </w:r>
           </w:p>
         </w:tc>
       </w:tr>
       <w:tr>
-        <w:tblPrEx>
-          <w:tblCellMar>
-            <w:top w:w="0" w:type="dxa"/>
-            <w:bottom w:w="0" w:type="dxa"/>
-          </w:tblCellMar>
-        </w:tblPrEx>
         <w:tc>
           <w:tcPr>
             <w:tcW w:w="700" w:type="dxa"/>
@@ -800,17 +885,15 @@
                 <w:rFonts w:ascii="Times New Roman" w:hAnsi="Times New Roman" w:cs="Times New Roman"/>
                 <w:sz w:val="22"/>
                 <w:szCs w:val="22"/>
-                <w:lang w:val="de-CH"/>
-              </w:rPr>
-            </w:pPr>
-            <w:r>
-              <w:rPr>
-                <w:rFonts w:ascii="Times New Roman" w:eastAsia="Times New Roman" w:hAnsi="Times New Roman" w:cs="Times New Roman"/>
-                <w:sz w:val="22"/>
-                <w:szCs w:val="22"/>
-                <w:lang w:val="de-CH"/>
-              </w:rPr>
-              <w:t>„Heisse Luft, wie Alles, was von Merkel kommt.“</w:t>
+              </w:rPr>
+            </w:pPr>
+            <w:r>
+              <w:rPr>
+                <w:rFonts w:ascii="Times New Roman" w:eastAsia="Times New Roman" w:hAnsi="Times New Roman" w:cs="Times New Roman"/>
+                <w:sz w:val="22"/>
+                <w:szCs w:val="22"/>
+              </w:rPr>
+              <w:t>"Hot air, like everything that comes from Merkel."</w:t>
             </w:r>
           </w:p>
           <w:p>
@@ -826,17 +909,15 @@
                 <w:rFonts w:ascii="Times New Roman" w:hAnsi="Times New Roman" w:cs="Times New Roman"/>
                 <w:sz w:val="22"/>
                 <w:szCs w:val="22"/>
-                <w:lang w:val="de-CH"/>
-              </w:rPr>
-            </w:pPr>
-            <w:r>
-              <w:rPr>
-                <w:rFonts w:ascii="Times New Roman" w:eastAsia="Times New Roman" w:hAnsi="Times New Roman" w:cs="Times New Roman"/>
-                <w:sz w:val="22"/>
-                <w:szCs w:val="22"/>
-                <w:lang w:val="de-CH"/>
-              </w:rPr>
-              <w:t xml:space="preserve">„Neun Punkte </w:t>
+              </w:rPr>
+            </w:pPr>
+            <w:r>
+              <w:rPr>
+                <w:rFonts w:ascii="Times New Roman" w:eastAsia="Times New Roman" w:hAnsi="Times New Roman" w:cs="Times New Roman"/>
+                <w:sz w:val="22"/>
+                <w:szCs w:val="22"/>
+              </w:rPr>
+              <w:t xml:space="preserve">"Nine points of </w:t>
             </w:r>
             <w:proofErr w:type="spellStart"/>
             <w:r>
@@ -844,9 +925,8 @@
                 <w:rFonts w:ascii="Times New Roman" w:eastAsia="Times New Roman" w:hAnsi="Times New Roman" w:cs="Times New Roman"/>
                 <w:sz w:val="22"/>
                 <w:szCs w:val="22"/>
-                <w:lang w:val="de-CH"/>
-              </w:rPr>
-              <w:t>BlaBla</w:t>
+              </w:rPr>
+              <w:t>blabla</w:t>
             </w:r>
             <w:proofErr w:type="spellEnd"/>
             <w:r>
@@ -854,9 +934,8 @@
                 <w:rFonts w:ascii="Times New Roman" w:eastAsia="Times New Roman" w:hAnsi="Times New Roman" w:cs="Times New Roman"/>
                 <w:sz w:val="22"/>
                 <w:szCs w:val="22"/>
-                <w:lang w:val="de-CH"/>
-              </w:rPr>
-              <w:t>, nichts konkretes, ein bisschen Gesülze.“</w:t>
+              </w:rPr>
+              <w:t>, nothing concrete, a bit of waffle."</w:t>
             </w:r>
           </w:p>
           <w:p>
@@ -880,56 +959,12 @@
                 <w:sz w:val="22"/>
                 <w:szCs w:val="22"/>
               </w:rPr>
-              <w:t>„</w:t>
-            </w:r>
-            <w:proofErr w:type="spellStart"/>
-            <w:r>
-              <w:rPr>
-                <w:rFonts w:ascii="Times New Roman" w:eastAsia="Times New Roman" w:hAnsi="Times New Roman" w:cs="Times New Roman"/>
-                <w:sz w:val="22"/>
-                <w:szCs w:val="22"/>
-              </w:rPr>
-              <w:t>Effektlose</w:t>
-            </w:r>
-            <w:proofErr w:type="spellEnd"/>
-            <w:r>
-              <w:rPr>
-                <w:rFonts w:ascii="Times New Roman" w:eastAsia="Times New Roman" w:hAnsi="Times New Roman" w:cs="Times New Roman"/>
-                <w:sz w:val="22"/>
-                <w:szCs w:val="22"/>
-              </w:rPr>
-              <w:t xml:space="preserve"> </w:t>
-            </w:r>
-            <w:proofErr w:type="spellStart"/>
-            <w:proofErr w:type="gramStart"/>
-            <w:r>
-              <w:rPr>
-                <w:rFonts w:ascii="Times New Roman" w:eastAsia="Times New Roman" w:hAnsi="Times New Roman" w:cs="Times New Roman"/>
-                <w:sz w:val="22"/>
-                <w:szCs w:val="22"/>
-              </w:rPr>
-              <w:t>Gelaber</w:t>
-            </w:r>
-            <w:proofErr w:type="spellEnd"/>
-            <w:r>
-              <w:rPr>
-                <w:rFonts w:ascii="Times New Roman" w:eastAsia="Times New Roman" w:hAnsi="Times New Roman" w:cs="Times New Roman"/>
-                <w:sz w:val="22"/>
-                <w:szCs w:val="22"/>
-              </w:rPr>
-              <w:t>.“</w:t>
-            </w:r>
-            <w:proofErr w:type="gramEnd"/>
+              <w:t>"Ineffective gibberish."</w:t>
+            </w:r>
           </w:p>
         </w:tc>
       </w:tr>
       <w:tr>
-        <w:tblPrEx>
-          <w:tblCellMar>
-            <w:top w:w="0" w:type="dxa"/>
-            <w:bottom w:w="0" w:type="dxa"/>
-          </w:tblCellMar>
-        </w:tblPrEx>
         <w:tc>
           <w:tcPr>
             <w:tcW w:w="700" w:type="dxa"/>
@@ -1031,7 +1066,16 @@
                 <w:sz w:val="22"/>
                 <w:szCs w:val="22"/>
               </w:rPr>
-              <w:t>Comment expresses both positive and negative sentiment toward the topic. Typically includes explicit contrast markers (e.g., „</w:t>
+              <w:t xml:space="preserve">Comment expresses both positive and negative sentiment toward the </w:t>
+            </w:r>
+            <w:r>
+              <w:rPr>
+                <w:rFonts w:ascii="Times New Roman" w:eastAsia="Times New Roman" w:hAnsi="Times New Roman" w:cs="Times New Roman"/>
+                <w:sz w:val="22"/>
+                <w:szCs w:val="22"/>
+              </w:rPr>
+              <w:lastRenderedPageBreak/>
+              <w:t>topic. Typically includes explicit contrast markers (e.g., „</w:t>
             </w:r>
             <w:proofErr w:type="spellStart"/>
             <w:proofErr w:type="gramStart"/>
@@ -1059,16 +1103,7 @@
                 <w:sz w:val="22"/>
                 <w:szCs w:val="22"/>
               </w:rPr>
-              <w:t xml:space="preserve">, </w:t>
-            </w:r>
-            <w:r>
-              <w:rPr>
-                <w:rFonts w:ascii="Times New Roman" w:eastAsia="Times New Roman" w:hAnsi="Times New Roman" w:cs="Times New Roman"/>
-                <w:sz w:val="22"/>
-                <w:szCs w:val="22"/>
-              </w:rPr>
-              <w:lastRenderedPageBreak/>
-              <w:t>„</w:t>
+              <w:t>, „</w:t>
             </w:r>
             <w:proofErr w:type="spellStart"/>
             <w:proofErr w:type="gramStart"/>
@@ -1176,18 +1211,16 @@
                 <w:rFonts w:ascii="Times New Roman" w:hAnsi="Times New Roman" w:cs="Times New Roman"/>
                 <w:sz w:val="22"/>
                 <w:szCs w:val="22"/>
-                <w:lang w:val="de-CH"/>
-              </w:rPr>
-            </w:pPr>
-            <w:r>
-              <w:rPr>
-                <w:rFonts w:ascii="Times New Roman" w:eastAsia="Times New Roman" w:hAnsi="Times New Roman" w:cs="Times New Roman"/>
-                <w:sz w:val="22"/>
-                <w:szCs w:val="22"/>
-                <w:lang w:val="de-CH"/>
+              </w:rPr>
+            </w:pPr>
+            <w:r>
+              <w:rPr>
+                <w:rFonts w:ascii="Times New Roman" w:eastAsia="Times New Roman" w:hAnsi="Times New Roman" w:cs="Times New Roman"/>
+                <w:sz w:val="22"/>
+                <w:szCs w:val="22"/>
               </w:rPr>
               <w:lastRenderedPageBreak/>
-              <w:t>„Im Prinzip ist der Plan ein guter Anfang, allein mir fehlt der Glaube an der konkreten Umsetzung.“</w:t>
+              <w:t>"In principle the plan is a good start, but I lack faith in the concrete implementation."</w:t>
             </w:r>
           </w:p>
           <w:p>
@@ -1203,17 +1236,16 @@
                 <w:rFonts w:ascii="Times New Roman" w:hAnsi="Times New Roman" w:cs="Times New Roman"/>
                 <w:sz w:val="22"/>
                 <w:szCs w:val="22"/>
-                <w:lang w:val="de-CH"/>
-              </w:rPr>
-            </w:pPr>
-            <w:r>
-              <w:rPr>
-                <w:rFonts w:ascii="Times New Roman" w:eastAsia="Times New Roman" w:hAnsi="Times New Roman" w:cs="Times New Roman"/>
-                <w:sz w:val="22"/>
-                <w:szCs w:val="22"/>
-                <w:lang w:val="de-CH"/>
-              </w:rPr>
-              <w:t>„Geht in die richtige Richtung – aber der Plan allein reicht nicht.“</w:t>
+              </w:rPr>
+            </w:pPr>
+            <w:r>
+              <w:rPr>
+                <w:rFonts w:ascii="Times New Roman" w:eastAsia="Times New Roman" w:hAnsi="Times New Roman" w:cs="Times New Roman"/>
+                <w:sz w:val="22"/>
+                <w:szCs w:val="22"/>
+              </w:rPr>
+              <w:lastRenderedPageBreak/>
+              <w:t>"Going in the right direction — but the plan alone is not enough."</w:t>
             </w:r>
           </w:p>
           <w:p>
@@ -1229,29 +1261,49 @@
                 <w:rFonts w:ascii="Times New Roman" w:hAnsi="Times New Roman" w:cs="Times New Roman"/>
                 <w:sz w:val="22"/>
                 <w:szCs w:val="22"/>
-                <w:lang w:val="de-CH"/>
-              </w:rPr>
-            </w:pPr>
-            <w:r>
-              <w:rPr>
-                <w:rFonts w:ascii="Times New Roman" w:eastAsia="Times New Roman" w:hAnsi="Times New Roman" w:cs="Times New Roman"/>
-                <w:sz w:val="22"/>
-                <w:szCs w:val="22"/>
-                <w:lang w:val="de-CH"/>
-              </w:rPr>
-              <w:lastRenderedPageBreak/>
-              <w:t>„Liest sich ganz gut, ist aber insgesamt viel zu unkonkret.“</w:t>
+              </w:rPr>
+            </w:pPr>
+            <w:r>
+              <w:rPr>
+                <w:rFonts w:ascii="Times New Roman" w:eastAsia="Times New Roman" w:hAnsi="Times New Roman" w:cs="Times New Roman"/>
+                <w:sz w:val="22"/>
+                <w:szCs w:val="22"/>
+              </w:rPr>
+              <w:t>„</w:t>
+            </w:r>
+            <w:r>
+              <w:t xml:space="preserve"> </w:t>
+            </w:r>
+            <w:r>
+              <w:rPr>
+                <w:rFonts w:ascii="Times New Roman" w:eastAsia="Times New Roman" w:hAnsi="Times New Roman" w:cs="Times New Roman"/>
+                <w:sz w:val="22"/>
+                <w:szCs w:val="22"/>
+              </w:rPr>
+              <w:t xml:space="preserve">"Reads quite well, but </w:t>
+            </w:r>
+            <w:proofErr w:type="gramStart"/>
+            <w:r>
+              <w:rPr>
+                <w:rFonts w:ascii="Times New Roman" w:eastAsia="Times New Roman" w:hAnsi="Times New Roman" w:cs="Times New Roman"/>
+                <w:sz w:val="22"/>
+                <w:szCs w:val="22"/>
+              </w:rPr>
+              <w:t>overall</w:t>
+            </w:r>
+            <w:proofErr w:type="gramEnd"/>
+            <w:r>
+              <w:rPr>
+                <w:rFonts w:ascii="Times New Roman" w:eastAsia="Times New Roman" w:hAnsi="Times New Roman" w:cs="Times New Roman"/>
+                <w:sz w:val="22"/>
+                <w:szCs w:val="22"/>
+              </w:rPr>
+              <w:t xml:space="preserve"> far too vague."</w:t>
             </w:r>
           </w:p>
         </w:tc>
       </w:tr>
       <w:tr>
-        <w:tblPrEx>
-          <w:tblCellMar>
-            <w:top w:w="0" w:type="dxa"/>
-            <w:bottom w:w="0" w:type="dxa"/>
-          </w:tblCellMar>
-        </w:tblPrEx>
         <w:tc>
           <w:tcPr>
             <w:tcW w:w="700" w:type="dxa"/>
@@ -1392,54 +1444,8 @@
                 <w:sz w:val="22"/>
                 <w:szCs w:val="22"/>
               </w:rPr>
-              <w:t>„</w:t>
-            </w:r>
-            <w:proofErr w:type="spellStart"/>
-            <w:r>
-              <w:rPr>
-                <w:rFonts w:ascii="Times New Roman" w:eastAsia="Times New Roman" w:hAnsi="Times New Roman" w:cs="Times New Roman"/>
-                <w:sz w:val="22"/>
-                <w:szCs w:val="22"/>
-              </w:rPr>
-              <w:t>Sehe</w:t>
-            </w:r>
-            <w:proofErr w:type="spellEnd"/>
-            <w:r>
-              <w:rPr>
-                <w:rFonts w:ascii="Times New Roman" w:eastAsia="Times New Roman" w:hAnsi="Times New Roman" w:cs="Times New Roman"/>
-                <w:sz w:val="22"/>
-                <w:szCs w:val="22"/>
-              </w:rPr>
-              <w:t xml:space="preserve"> ich </w:t>
-            </w:r>
-            <w:proofErr w:type="spellStart"/>
-            <w:r>
-              <w:rPr>
-                <w:rFonts w:ascii="Times New Roman" w:eastAsia="Times New Roman" w:hAnsi="Times New Roman" w:cs="Times New Roman"/>
-                <w:sz w:val="22"/>
-                <w:szCs w:val="22"/>
-              </w:rPr>
-              <w:t>auch</w:t>
-            </w:r>
-            <w:proofErr w:type="spellEnd"/>
-            <w:r>
-              <w:rPr>
-                <w:rFonts w:ascii="Times New Roman" w:eastAsia="Times New Roman" w:hAnsi="Times New Roman" w:cs="Times New Roman"/>
-                <w:sz w:val="22"/>
-                <w:szCs w:val="22"/>
-              </w:rPr>
-              <w:t xml:space="preserve"> </w:t>
-            </w:r>
-            <w:proofErr w:type="gramStart"/>
-            <w:r>
-              <w:rPr>
-                <w:rFonts w:ascii="Times New Roman" w:eastAsia="Times New Roman" w:hAnsi="Times New Roman" w:cs="Times New Roman"/>
-                <w:sz w:val="22"/>
-                <w:szCs w:val="22"/>
-              </w:rPr>
-              <w:t>so.“</w:t>
-            </w:r>
-            <w:proofErr w:type="gramEnd"/>
+              <w:t>"I see it the same way."</w:t>
+            </w:r>
           </w:p>
           <w:p>
             <w:pPr>
@@ -1462,28 +1468,8 @@
                 <w:sz w:val="22"/>
                 <w:szCs w:val="22"/>
               </w:rPr>
-              <w:t>„</w:t>
-            </w:r>
-            <w:proofErr w:type="spellStart"/>
-            <w:proofErr w:type="gramStart"/>
-            <w:r>
-              <w:rPr>
-                <w:rFonts w:ascii="Times New Roman" w:eastAsia="Times New Roman" w:hAnsi="Times New Roman" w:cs="Times New Roman"/>
-                <w:sz w:val="22"/>
-                <w:szCs w:val="22"/>
-              </w:rPr>
-              <w:t>Einverstanden</w:t>
-            </w:r>
-            <w:proofErr w:type="spellEnd"/>
-            <w:r>
-              <w:rPr>
-                <w:rFonts w:ascii="Times New Roman" w:eastAsia="Times New Roman" w:hAnsi="Times New Roman" w:cs="Times New Roman"/>
-                <w:sz w:val="22"/>
-                <w:szCs w:val="22"/>
-              </w:rPr>
-              <w:t>.“</w:t>
-            </w:r>
-            <w:proofErr w:type="gramEnd"/>
+              <w:t>"Agreed."</w:t>
+            </w:r>
           </w:p>
           <w:p>
             <w:pPr>
@@ -1498,15 +1484,17 @@
                 <w:rFonts w:ascii="Times New Roman" w:hAnsi="Times New Roman" w:cs="Times New Roman"/>
                 <w:sz w:val="22"/>
                 <w:szCs w:val="22"/>
-              </w:rPr>
-            </w:pPr>
-            <w:r>
-              <w:rPr>
-                <w:rFonts w:ascii="Times New Roman" w:eastAsia="Times New Roman" w:hAnsi="Times New Roman" w:cs="Times New Roman"/>
-                <w:sz w:val="22"/>
-                <w:szCs w:val="22"/>
-              </w:rPr>
-              <w:t xml:space="preserve">„So </w:t>
+                <w:lang w:val="de-CH"/>
+              </w:rPr>
+            </w:pPr>
+            <w:r>
+              <w:rPr>
+                <w:rFonts w:ascii="Times New Roman" w:eastAsia="Times New Roman" w:hAnsi="Times New Roman" w:cs="Times New Roman"/>
+                <w:sz w:val="22"/>
+                <w:szCs w:val="22"/>
+                <w:lang w:val="de-CH"/>
+              </w:rPr>
+              <w:t>"</w:t>
             </w:r>
             <w:proofErr w:type="spellStart"/>
             <w:r>
@@ -1514,8 +1502,9 @@
                 <w:rFonts w:ascii="Times New Roman" w:eastAsia="Times New Roman" w:hAnsi="Times New Roman" w:cs="Times New Roman"/>
                 <w:sz w:val="22"/>
                 <w:szCs w:val="22"/>
-              </w:rPr>
-              <w:t>ist</w:t>
+                <w:lang w:val="de-CH"/>
+              </w:rPr>
+              <w:t>That's</w:t>
             </w:r>
             <w:proofErr w:type="spellEnd"/>
             <w:r>
@@ -1523,19 +1512,70 @@
                 <w:rFonts w:ascii="Times New Roman" w:eastAsia="Times New Roman" w:hAnsi="Times New Roman" w:cs="Times New Roman"/>
                 <w:sz w:val="22"/>
                 <w:szCs w:val="22"/>
+                <w:lang w:val="de-CH"/>
               </w:rPr>
               <w:t xml:space="preserve"> </w:t>
             </w:r>
-            <w:proofErr w:type="gramStart"/>
-            <w:r>
-              <w:rPr>
-                <w:rFonts w:ascii="Times New Roman" w:eastAsia="Times New Roman" w:hAnsi="Times New Roman" w:cs="Times New Roman"/>
-                <w:sz w:val="22"/>
-                <w:szCs w:val="22"/>
-              </w:rPr>
-              <w:t>es!“</w:t>
-            </w:r>
-            <w:proofErr w:type="gramEnd"/>
+            <w:proofErr w:type="spellStart"/>
+            <w:r>
+              <w:rPr>
+                <w:rFonts w:ascii="Times New Roman" w:eastAsia="Times New Roman" w:hAnsi="Times New Roman" w:cs="Times New Roman"/>
+                <w:sz w:val="22"/>
+                <w:szCs w:val="22"/>
+                <w:lang w:val="de-CH"/>
+              </w:rPr>
+              <w:t>how</w:t>
+            </w:r>
+            <w:proofErr w:type="spellEnd"/>
+            <w:r>
+              <w:rPr>
+                <w:rFonts w:ascii="Times New Roman" w:eastAsia="Times New Roman" w:hAnsi="Times New Roman" w:cs="Times New Roman"/>
+                <w:sz w:val="22"/>
+                <w:szCs w:val="22"/>
+                <w:lang w:val="de-CH"/>
+              </w:rPr>
+              <w:t xml:space="preserve"> </w:t>
+            </w:r>
+            <w:proofErr w:type="spellStart"/>
+            <w:r>
+              <w:rPr>
+                <w:rFonts w:ascii="Times New Roman" w:eastAsia="Times New Roman" w:hAnsi="Times New Roman" w:cs="Times New Roman"/>
+                <w:sz w:val="22"/>
+                <w:szCs w:val="22"/>
+                <w:lang w:val="de-CH"/>
+              </w:rPr>
+              <w:t>it</w:t>
+            </w:r>
+            <w:proofErr w:type="spellEnd"/>
+            <w:r>
+              <w:rPr>
+                <w:rFonts w:ascii="Times New Roman" w:eastAsia="Times New Roman" w:hAnsi="Times New Roman" w:cs="Times New Roman"/>
+                <w:sz w:val="22"/>
+                <w:szCs w:val="22"/>
+                <w:lang w:val="de-CH"/>
+              </w:rPr>
+              <w:t xml:space="preserve"> </w:t>
+            </w:r>
+            <w:proofErr w:type="spellStart"/>
+            <w:r>
+              <w:rPr>
+                <w:rFonts w:ascii="Times New Roman" w:eastAsia="Times New Roman" w:hAnsi="Times New Roman" w:cs="Times New Roman"/>
+                <w:sz w:val="22"/>
+                <w:szCs w:val="22"/>
+                <w:lang w:val="de-CH"/>
+              </w:rPr>
+              <w:t>is</w:t>
+            </w:r>
+            <w:proofErr w:type="spellEnd"/>
+            <w:r>
+              <w:rPr>
+                <w:rFonts w:ascii="Times New Roman" w:eastAsia="Times New Roman" w:hAnsi="Times New Roman" w:cs="Times New Roman"/>
+                <w:sz w:val="22"/>
+                <w:szCs w:val="22"/>
+                <w:lang w:val="de-CH"/>
+              </w:rPr>
+              <w:t>!"</w:t>
+            </w:r>
           </w:p>
           <w:p>
             <w:pPr>
@@ -1550,37 +1590,15 @@
                 <w:rFonts w:ascii="Times New Roman" w:hAnsi="Times New Roman" w:cs="Times New Roman"/>
                 <w:sz w:val="22"/>
                 <w:szCs w:val="22"/>
-                <w:lang w:val="de-CH"/>
-              </w:rPr>
-            </w:pPr>
-            <w:r>
-              <w:rPr>
-                <w:rFonts w:ascii="Times New Roman" w:eastAsia="Times New Roman" w:hAnsi="Times New Roman" w:cs="Times New Roman"/>
-                <w:sz w:val="22"/>
-                <w:szCs w:val="22"/>
-                <w:lang w:val="de-CH"/>
-              </w:rPr>
-              <w:t xml:space="preserve">„Der Aussage stimme ich </w:t>
-            </w:r>
-            <w:proofErr w:type="gramStart"/>
-            <w:r>
-              <w:rPr>
-                <w:rFonts w:ascii="Times New Roman" w:eastAsia="Times New Roman" w:hAnsi="Times New Roman" w:cs="Times New Roman"/>
-                <w:sz w:val="22"/>
-                <w:szCs w:val="22"/>
-                <w:lang w:val="de-CH"/>
-              </w:rPr>
-              <w:t xml:space="preserve">voll und ganz </w:t>
-            </w:r>
-            <w:proofErr w:type="gramEnd"/>
-            <w:r>
-              <w:rPr>
-                <w:rFonts w:ascii="Times New Roman" w:eastAsia="Times New Roman" w:hAnsi="Times New Roman" w:cs="Times New Roman"/>
-                <w:sz w:val="22"/>
-                <w:szCs w:val="22"/>
-                <w:lang w:val="de-CH"/>
-              </w:rPr>
-              <w:t>zu.“</w:t>
+              </w:rPr>
+            </w:pPr>
+            <w:r>
+              <w:rPr>
+                <w:rFonts w:ascii="Times New Roman" w:eastAsia="Times New Roman" w:hAnsi="Times New Roman" w:cs="Times New Roman"/>
+                <w:sz w:val="22"/>
+                <w:szCs w:val="22"/>
+              </w:rPr>
+              <w:t>"I fully agree with the statement."</w:t>
             </w:r>
           </w:p>
         </w:tc>
@@ -1595,7 +1613,6 @@
           <w:rFonts w:ascii="Times New Roman" w:hAnsi="Times New Roman" w:cs="Times New Roman"/>
           <w:sz w:val="22"/>
           <w:szCs w:val="22"/>
-          <w:lang w:val="de-CH"/>
         </w:rPr>
       </w:pPr>
     </w:p>
@@ -1657,16 +1674,10 @@
       <w:tblGrid>
         <w:gridCol w:w="729"/>
         <w:gridCol w:w="1199"/>
-        <w:gridCol w:w="3547"/>
-        <w:gridCol w:w="3551"/>
+        <w:gridCol w:w="3548"/>
+        <w:gridCol w:w="3550"/>
       </w:tblGrid>
       <w:tr>
-        <w:tblPrEx>
-          <w:tblCellMar>
-            <w:top w:w="0" w:type="dxa"/>
-            <w:bottom w:w="0" w:type="dxa"/>
-          </w:tblCellMar>
-        </w:tblPrEx>
         <w:tc>
           <w:tcPr>
             <w:tcW w:w="700" w:type="dxa"/>
@@ -1817,12 +1828,6 @@
         </w:tc>
       </w:tr>
       <w:tr>
-        <w:tblPrEx>
-          <w:tblCellMar>
-            <w:top w:w="0" w:type="dxa"/>
-            <w:bottom w:w="0" w:type="dxa"/>
-          </w:tblCellMar>
-        </w:tblPrEx>
         <w:tc>
           <w:tcPr>
             <w:tcW w:w="700" w:type="dxa"/>
@@ -1966,17 +1971,33 @@
                 <w:rFonts w:ascii="Times New Roman" w:hAnsi="Times New Roman" w:cs="Times New Roman"/>
                 <w:sz w:val="22"/>
                 <w:szCs w:val="22"/>
-                <w:lang w:val="de-CH"/>
-              </w:rPr>
-            </w:pPr>
-            <w:r>
-              <w:rPr>
-                <w:rFonts w:ascii="Times New Roman" w:eastAsia="Times New Roman" w:hAnsi="Times New Roman" w:cs="Times New Roman"/>
-                <w:sz w:val="22"/>
-                <w:szCs w:val="22"/>
-                <w:lang w:val="de-CH"/>
-              </w:rPr>
-              <w:t>„Ich habe letztes Jahr die Terroranschläge in der Türkei miterlebt.“</w:t>
+              </w:rPr>
+            </w:pPr>
+            <w:r>
+              <w:rPr>
+                <w:rFonts w:ascii="Times New Roman" w:eastAsia="Times New Roman" w:hAnsi="Times New Roman" w:cs="Times New Roman"/>
+                <w:sz w:val="22"/>
+                <w:szCs w:val="22"/>
+              </w:rPr>
+              <w:t xml:space="preserve">"I have become afraid and changed my </w:t>
+            </w:r>
+            <w:proofErr w:type="spellStart"/>
+            <w:r>
+              <w:rPr>
+                <w:rFonts w:ascii="Times New Roman" w:eastAsia="Times New Roman" w:hAnsi="Times New Roman" w:cs="Times New Roman"/>
+                <w:sz w:val="22"/>
+                <w:szCs w:val="22"/>
+              </w:rPr>
+              <w:t>behavior</w:t>
+            </w:r>
+            <w:proofErr w:type="spellEnd"/>
+            <w:r>
+              <w:rPr>
+                <w:rFonts w:ascii="Times New Roman" w:eastAsia="Times New Roman" w:hAnsi="Times New Roman" w:cs="Times New Roman"/>
+                <w:sz w:val="22"/>
+                <w:szCs w:val="22"/>
+              </w:rPr>
+              <w:t>. I avoid certain holiday destinations."</w:t>
             </w:r>
           </w:p>
           <w:p>
@@ -1992,24 +2013,17 @@
                 <w:rFonts w:ascii="Times New Roman" w:hAnsi="Times New Roman" w:cs="Times New Roman"/>
                 <w:sz w:val="22"/>
                 <w:szCs w:val="22"/>
-              </w:rPr>
-            </w:pPr>
-            <w:r>
-              <w:rPr>
-                <w:rFonts w:ascii="Times New Roman" w:eastAsia="Times New Roman" w:hAnsi="Times New Roman" w:cs="Times New Roman"/>
-                <w:sz w:val="22"/>
-                <w:szCs w:val="22"/>
                 <w:lang w:val="de-CH"/>
               </w:rPr>
-              <w:t xml:space="preserve">„Ich habe Angst und mein Verhalten geändert. </w:t>
-            </w:r>
-            <w:r>
-              <w:rPr>
-                <w:rFonts w:ascii="Times New Roman" w:eastAsia="Times New Roman" w:hAnsi="Times New Roman" w:cs="Times New Roman"/>
-                <w:sz w:val="22"/>
-                <w:szCs w:val="22"/>
-              </w:rPr>
-              <w:t xml:space="preserve">Meide </w:t>
+            </w:pPr>
+            <w:r>
+              <w:rPr>
+                <w:rFonts w:ascii="Times New Roman" w:eastAsia="Times New Roman" w:hAnsi="Times New Roman" w:cs="Times New Roman"/>
+                <w:sz w:val="22"/>
+                <w:szCs w:val="22"/>
+                <w:lang w:val="de-CH"/>
+              </w:rPr>
+              <w:t xml:space="preserve">"I </w:t>
             </w:r>
             <w:proofErr w:type="spellStart"/>
             <w:r>
@@ -2017,8 +2031,9 @@
                 <w:rFonts w:ascii="Times New Roman" w:eastAsia="Times New Roman" w:hAnsi="Times New Roman" w:cs="Times New Roman"/>
                 <w:sz w:val="22"/>
                 <w:szCs w:val="22"/>
-              </w:rPr>
-              <w:t>gewisse</w:t>
+                <w:lang w:val="de-CH"/>
+              </w:rPr>
+              <w:t>witnessed</w:t>
             </w:r>
             <w:proofErr w:type="spellEnd"/>
             <w:r>
@@ -2026,18 +2041,19 @@
                 <w:rFonts w:ascii="Times New Roman" w:eastAsia="Times New Roman" w:hAnsi="Times New Roman" w:cs="Times New Roman"/>
                 <w:sz w:val="22"/>
                 <w:szCs w:val="22"/>
+                <w:lang w:val="de-CH"/>
               </w:rPr>
               <w:t xml:space="preserve"> </w:t>
             </w:r>
             <w:proofErr w:type="spellStart"/>
-            <w:proofErr w:type="gramStart"/>
-            <w:r>
-              <w:rPr>
-                <w:rFonts w:ascii="Times New Roman" w:eastAsia="Times New Roman" w:hAnsi="Times New Roman" w:cs="Times New Roman"/>
-                <w:sz w:val="22"/>
-                <w:szCs w:val="22"/>
-              </w:rPr>
-              <w:t>Urlausländer</w:t>
+            <w:r>
+              <w:rPr>
+                <w:rFonts w:ascii="Times New Roman" w:eastAsia="Times New Roman" w:hAnsi="Times New Roman" w:cs="Times New Roman"/>
+                <w:sz w:val="22"/>
+                <w:szCs w:val="22"/>
+                <w:lang w:val="de-CH"/>
+              </w:rPr>
+              <w:t>the</w:t>
             </w:r>
             <w:proofErr w:type="spellEnd"/>
             <w:r>
@@ -2045,10 +2061,70 @@
                 <w:rFonts w:ascii="Times New Roman" w:eastAsia="Times New Roman" w:hAnsi="Times New Roman" w:cs="Times New Roman"/>
                 <w:sz w:val="22"/>
                 <w:szCs w:val="22"/>
-              </w:rPr>
-              <w:t>.“</w:t>
-            </w:r>
-            <w:proofErr w:type="gramEnd"/>
+                <w:lang w:val="de-CH"/>
+              </w:rPr>
+              <w:t xml:space="preserve"> </w:t>
+            </w:r>
+            <w:proofErr w:type="spellStart"/>
+            <w:r>
+              <w:rPr>
+                <w:rFonts w:ascii="Times New Roman" w:eastAsia="Times New Roman" w:hAnsi="Times New Roman" w:cs="Times New Roman"/>
+                <w:sz w:val="22"/>
+                <w:szCs w:val="22"/>
+                <w:lang w:val="de-CH"/>
+              </w:rPr>
+              <w:t>terrorist</w:t>
+            </w:r>
+            <w:proofErr w:type="spellEnd"/>
+            <w:r>
+              <w:rPr>
+                <w:rFonts w:ascii="Times New Roman" w:eastAsia="Times New Roman" w:hAnsi="Times New Roman" w:cs="Times New Roman"/>
+                <w:sz w:val="22"/>
+                <w:szCs w:val="22"/>
+                <w:lang w:val="de-CH"/>
+              </w:rPr>
+              <w:t xml:space="preserve"> </w:t>
+            </w:r>
+            <w:proofErr w:type="spellStart"/>
+            <w:r>
+              <w:rPr>
+                <w:rFonts w:ascii="Times New Roman" w:eastAsia="Times New Roman" w:hAnsi="Times New Roman" w:cs="Times New Roman"/>
+                <w:sz w:val="22"/>
+                <w:szCs w:val="22"/>
+                <w:lang w:val="de-CH"/>
+              </w:rPr>
+              <w:t>attacks</w:t>
+            </w:r>
+            <w:proofErr w:type="spellEnd"/>
+            <w:r>
+              <w:rPr>
+                <w:rFonts w:ascii="Times New Roman" w:eastAsia="Times New Roman" w:hAnsi="Times New Roman" w:cs="Times New Roman"/>
+                <w:sz w:val="22"/>
+                <w:szCs w:val="22"/>
+                <w:lang w:val="de-CH"/>
+              </w:rPr>
+              <w:t xml:space="preserve"> in Turkey last </w:t>
+            </w:r>
+            <w:proofErr w:type="spellStart"/>
+            <w:r>
+              <w:rPr>
+                <w:rFonts w:ascii="Times New Roman" w:eastAsia="Times New Roman" w:hAnsi="Times New Roman" w:cs="Times New Roman"/>
+                <w:sz w:val="22"/>
+                <w:szCs w:val="22"/>
+                <w:lang w:val="de-CH"/>
+              </w:rPr>
+              <w:t>year</w:t>
+            </w:r>
+            <w:proofErr w:type="spellEnd"/>
+            <w:r>
+              <w:rPr>
+                <w:rFonts w:ascii="Times New Roman" w:eastAsia="Times New Roman" w:hAnsi="Times New Roman" w:cs="Times New Roman"/>
+                <w:sz w:val="22"/>
+                <w:szCs w:val="22"/>
+                <w:lang w:val="de-CH"/>
+              </w:rPr>
+              <w:t>."</w:t>
+            </w:r>
           </w:p>
           <w:p>
             <w:pPr>
@@ -2063,48 +2139,20 @@
                 <w:rFonts w:ascii="Times New Roman" w:hAnsi="Times New Roman" w:cs="Times New Roman"/>
                 <w:sz w:val="22"/>
                 <w:szCs w:val="22"/>
-                <w:lang w:val="de-CH"/>
-              </w:rPr>
-            </w:pPr>
-            <w:r>
-              <w:rPr>
-                <w:rFonts w:ascii="Times New Roman" w:eastAsia="Times New Roman" w:hAnsi="Times New Roman" w:cs="Times New Roman"/>
-                <w:sz w:val="22"/>
-                <w:szCs w:val="22"/>
-                <w:lang w:val="de-CH"/>
-              </w:rPr>
-              <w:t xml:space="preserve">„Ich finde es </w:t>
-            </w:r>
-            <w:proofErr w:type="spellStart"/>
-            <w:r>
-              <w:rPr>
-                <w:rFonts w:ascii="Times New Roman" w:eastAsia="Times New Roman" w:hAnsi="Times New Roman" w:cs="Times New Roman"/>
-                <w:sz w:val="22"/>
-                <w:szCs w:val="22"/>
-                <w:lang w:val="de-CH"/>
-              </w:rPr>
-              <w:t>beangstigend</w:t>
-            </w:r>
-            <w:proofErr w:type="spellEnd"/>
-            <w:r>
-              <w:rPr>
-                <w:rFonts w:ascii="Times New Roman" w:eastAsia="Times New Roman" w:hAnsi="Times New Roman" w:cs="Times New Roman"/>
-                <w:sz w:val="22"/>
-                <w:szCs w:val="22"/>
-                <w:lang w:val="de-CH"/>
-              </w:rPr>
-              <w:t xml:space="preserve"> und es schränkt einen zunehmend ein in seiner Freiheit.“</w:t>
+              </w:rPr>
+            </w:pPr>
+            <w:r>
+              <w:rPr>
+                <w:rFonts w:ascii="Times New Roman" w:eastAsia="Times New Roman" w:hAnsi="Times New Roman" w:cs="Times New Roman"/>
+                <w:sz w:val="22"/>
+                <w:szCs w:val="22"/>
+              </w:rPr>
+              <w:t>"I find it frightening and it increasingly restricts one's freedom."</w:t>
             </w:r>
           </w:p>
         </w:tc>
       </w:tr>
       <w:tr>
-        <w:tblPrEx>
-          <w:tblCellMar>
-            <w:top w:w="0" w:type="dxa"/>
-            <w:bottom w:w="0" w:type="dxa"/>
-          </w:tblCellMar>
-        </w:tblPrEx>
         <w:tc>
           <w:tcPr>
             <w:tcW w:w="700" w:type="dxa"/>
@@ -2280,17 +2328,15 @@
                 <w:rFonts w:ascii="Times New Roman" w:hAnsi="Times New Roman" w:cs="Times New Roman"/>
                 <w:sz w:val="22"/>
                 <w:szCs w:val="22"/>
-                <w:lang w:val="de-CH"/>
-              </w:rPr>
-            </w:pPr>
-            <w:r>
-              <w:rPr>
-                <w:rFonts w:ascii="Times New Roman" w:eastAsia="Times New Roman" w:hAnsi="Times New Roman" w:cs="Times New Roman"/>
-                <w:sz w:val="22"/>
-                <w:szCs w:val="22"/>
-                <w:lang w:val="de-CH"/>
-              </w:rPr>
-              <w:t>„Ich vermisse konkrete Empfehlungen, wie dies umgesetzt werden soll.“</w:t>
+              </w:rPr>
+            </w:pPr>
+            <w:r>
+              <w:rPr>
+                <w:rFonts w:ascii="Times New Roman" w:eastAsia="Times New Roman" w:hAnsi="Times New Roman" w:cs="Times New Roman"/>
+                <w:sz w:val="22"/>
+                <w:szCs w:val="22"/>
+              </w:rPr>
+              <w:t>"I also find it really unfortunate that the police are not allowed to do more."</w:t>
             </w:r>
           </w:p>
           <w:p>
@@ -2306,17 +2352,15 @@
                 <w:rFonts w:ascii="Times New Roman" w:hAnsi="Times New Roman" w:cs="Times New Roman"/>
                 <w:sz w:val="22"/>
                 <w:szCs w:val="22"/>
-                <w:lang w:val="de-CH"/>
-              </w:rPr>
-            </w:pPr>
-            <w:r>
-              <w:rPr>
-                <w:rFonts w:ascii="Times New Roman" w:eastAsia="Times New Roman" w:hAnsi="Times New Roman" w:cs="Times New Roman"/>
-                <w:sz w:val="22"/>
-                <w:szCs w:val="22"/>
-                <w:lang w:val="de-CH"/>
-              </w:rPr>
-              <w:t>„Ich finde den Plan grundsätzlich gut, aber die Umsetzung bereitet mir Sorgen.“</w:t>
+              </w:rPr>
+            </w:pPr>
+            <w:r>
+              <w:rPr>
+                <w:rFonts w:ascii="Times New Roman" w:eastAsia="Times New Roman" w:hAnsi="Times New Roman" w:cs="Times New Roman"/>
+                <w:sz w:val="22"/>
+                <w:szCs w:val="22"/>
+              </w:rPr>
+              <w:t>"I personally think that terrorism cannot be stopped."</w:t>
             </w:r>
           </w:p>
           <w:p>
@@ -2332,28 +2376,20 @@
                 <w:rFonts w:ascii="Times New Roman" w:hAnsi="Times New Roman" w:cs="Times New Roman"/>
                 <w:sz w:val="22"/>
                 <w:szCs w:val="22"/>
-                <w:lang w:val="de-CH"/>
-              </w:rPr>
-            </w:pPr>
-            <w:r>
-              <w:rPr>
-                <w:rFonts w:ascii="Times New Roman" w:eastAsia="Times New Roman" w:hAnsi="Times New Roman" w:cs="Times New Roman"/>
-                <w:sz w:val="22"/>
-                <w:szCs w:val="22"/>
-                <w:lang w:val="de-CH"/>
-              </w:rPr>
-              <w:t>„Ich bin der Meinung, dass die Polizei hier besser ausgerüstet werden müsste.“</w:t>
+              </w:rPr>
+            </w:pPr>
+            <w:r>
+              <w:rPr>
+                <w:rFonts w:ascii="Times New Roman" w:eastAsia="Times New Roman" w:hAnsi="Times New Roman" w:cs="Times New Roman"/>
+                <w:sz w:val="22"/>
+                <w:szCs w:val="22"/>
+              </w:rPr>
+              <w:t>"In my opinion, the 9-point plan is not well developed."</w:t>
             </w:r>
           </w:p>
         </w:tc>
       </w:tr>
       <w:tr>
-        <w:tblPrEx>
-          <w:tblCellMar>
-            <w:top w:w="0" w:type="dxa"/>
-            <w:bottom w:w="0" w:type="dxa"/>
-          </w:tblCellMar>
-        </w:tblPrEx>
         <w:tc>
           <w:tcPr>
             <w:tcW w:w="700" w:type="dxa"/>
@@ -2489,17 +2525,15 @@
                 <w:rFonts w:ascii="Times New Roman" w:hAnsi="Times New Roman" w:cs="Times New Roman"/>
                 <w:sz w:val="22"/>
                 <w:szCs w:val="22"/>
-                <w:lang w:val="de-CH"/>
-              </w:rPr>
-            </w:pPr>
-            <w:r>
-              <w:rPr>
-                <w:rFonts w:ascii="Times New Roman" w:eastAsia="Times New Roman" w:hAnsi="Times New Roman" w:cs="Times New Roman"/>
-                <w:sz w:val="22"/>
-                <w:szCs w:val="22"/>
-                <w:lang w:val="de-CH"/>
-              </w:rPr>
-              <w:t>„Bundeswehr im Inneren? Hier verstösst sie gegen das Grundgesetz.“</w:t>
+              </w:rPr>
+            </w:pPr>
+            <w:r>
+              <w:rPr>
+                <w:rFonts w:ascii="Times New Roman" w:eastAsia="Times New Roman" w:hAnsi="Times New Roman" w:cs="Times New Roman"/>
+                <w:sz w:val="22"/>
+                <w:szCs w:val="22"/>
+              </w:rPr>
+              <w:t>"Deploying the armed forces internally violates the Basic Law."</w:t>
             </w:r>
           </w:p>
           <w:p>
@@ -2525,7 +2559,47 @@
                 <w:szCs w:val="22"/>
                 <w:lang w:val="de-CH"/>
               </w:rPr>
-              <w:t>„Die genannten Maßnahmen sind überfällig.“</w:t>
+              <w:t xml:space="preserve">"Hire </w:t>
+            </w:r>
+            <w:proofErr w:type="spellStart"/>
+            <w:r>
+              <w:rPr>
+                <w:rFonts w:ascii="Times New Roman" w:eastAsia="Times New Roman" w:hAnsi="Times New Roman" w:cs="Times New Roman"/>
+                <w:sz w:val="22"/>
+                <w:szCs w:val="22"/>
+                <w:lang w:val="de-CH"/>
+              </w:rPr>
+              <w:t>more</w:t>
+            </w:r>
+            <w:proofErr w:type="spellEnd"/>
+            <w:r>
+              <w:rPr>
+                <w:rFonts w:ascii="Times New Roman" w:eastAsia="Times New Roman" w:hAnsi="Times New Roman" w:cs="Times New Roman"/>
+                <w:sz w:val="22"/>
+                <w:szCs w:val="22"/>
+                <w:lang w:val="de-CH"/>
+              </w:rPr>
+              <w:t xml:space="preserve"> </w:t>
+            </w:r>
+            <w:proofErr w:type="spellStart"/>
+            <w:r>
+              <w:rPr>
+                <w:rFonts w:ascii="Times New Roman" w:eastAsia="Times New Roman" w:hAnsi="Times New Roman" w:cs="Times New Roman"/>
+                <w:sz w:val="22"/>
+                <w:szCs w:val="22"/>
+                <w:lang w:val="de-CH"/>
+              </w:rPr>
+              <w:t>staff</w:t>
+            </w:r>
+            <w:proofErr w:type="spellEnd"/>
+            <w:r>
+              <w:rPr>
+                <w:rFonts w:ascii="Times New Roman" w:eastAsia="Times New Roman" w:hAnsi="Times New Roman" w:cs="Times New Roman"/>
+                <w:sz w:val="22"/>
+                <w:szCs w:val="22"/>
+                <w:lang w:val="de-CH"/>
+              </w:rPr>
+              <w:t>."</w:t>
             </w:r>
           </w:p>
           <w:p>
@@ -2541,17 +2615,15 @@
                 <w:rFonts w:ascii="Times New Roman" w:hAnsi="Times New Roman" w:cs="Times New Roman"/>
                 <w:sz w:val="22"/>
                 <w:szCs w:val="22"/>
-                <w:lang w:val="de-CH"/>
-              </w:rPr>
-            </w:pPr>
-            <w:r>
-              <w:rPr>
-                <w:rFonts w:ascii="Times New Roman" w:eastAsia="Times New Roman" w:hAnsi="Times New Roman" w:cs="Times New Roman"/>
-                <w:sz w:val="22"/>
-                <w:szCs w:val="22"/>
-                <w:lang w:val="de-CH"/>
-              </w:rPr>
-              <w:t>„Prävention ist in jedem Falle besser als Leichen aufsammeln zu müssen.“</w:t>
+              </w:rPr>
+            </w:pPr>
+            <w:r>
+              <w:rPr>
+                <w:rFonts w:ascii="Times New Roman" w:eastAsia="Times New Roman" w:hAnsi="Times New Roman" w:cs="Times New Roman"/>
+                <w:sz w:val="22"/>
+                <w:szCs w:val="22"/>
+              </w:rPr>
+              <w:t>"Weapons purchases should not only be restricted online."</w:t>
             </w:r>
           </w:p>
         </w:tc>
@@ -2566,7 +2638,933 @@
           <w:rFonts w:ascii="Times New Roman" w:hAnsi="Times New Roman" w:cs="Times New Roman"/>
           <w:sz w:val="22"/>
           <w:szCs w:val="22"/>
-          <w:lang w:val="de-CH"/>
+        </w:rPr>
+      </w:pPr>
+    </w:p>
+    <w:p>
+      <w:pPr>
+        <w:spacing w:before="200" w:after="100"/>
+        <w:rPr>
+          <w:rFonts w:ascii="Times New Roman" w:hAnsi="Times New Roman" w:cs="Times New Roman"/>
+          <w:sz w:val="22"/>
+          <w:szCs w:val="22"/>
+        </w:rPr>
+      </w:pPr>
+      <w:r>
+        <w:rPr>
+          <w:rFonts w:ascii="Times New Roman" w:eastAsia="Times New Roman" w:hAnsi="Times New Roman" w:cs="Times New Roman"/>
+          <w:b/>
+          <w:bCs/>
+          <w:caps/>
+          <w:sz w:val="22"/>
+          <w:szCs w:val="22"/>
+        </w:rPr>
+        <w:t xml:space="preserve">DIMENSION </w:t>
+      </w:r>
+      <w:r>
+        <w:rPr>
+          <w:rFonts w:ascii="Times New Roman" w:eastAsia="Times New Roman" w:hAnsi="Times New Roman" w:cs="Times New Roman"/>
+          <w:b/>
+          <w:bCs/>
+          <w:caps/>
+          <w:sz w:val="22"/>
+          <w:szCs w:val="22"/>
+        </w:rPr>
+        <w:t>3</w:t>
+      </w:r>
+      <w:r>
+        <w:rPr>
+          <w:rFonts w:ascii="Times New Roman" w:eastAsia="Times New Roman" w:hAnsi="Times New Roman" w:cs="Times New Roman"/>
+          <w:b/>
+          <w:bCs/>
+          <w:caps/>
+          <w:sz w:val="22"/>
+          <w:szCs w:val="22"/>
+        </w:rPr>
+        <w:t xml:space="preserve">: </w:t>
+      </w:r>
+      <w:r>
+        <w:rPr>
+          <w:rFonts w:ascii="Times New Roman" w:eastAsia="Times New Roman" w:hAnsi="Times New Roman" w:cs="Times New Roman"/>
+          <w:b/>
+          <w:bCs/>
+          <w:caps/>
+          <w:sz w:val="22"/>
+          <w:szCs w:val="22"/>
+        </w:rPr>
+        <w:t>Controversy</w:t>
+      </w:r>
+    </w:p>
+    <w:p>
+      <w:pPr>
+        <w:rPr>
+          <w:rFonts w:ascii="Times New Roman" w:hAnsi="Times New Roman" w:cs="Times New Roman"/>
+          <w:sz w:val="22"/>
+          <w:szCs w:val="22"/>
+        </w:rPr>
+      </w:pPr>
+      <w:r>
+        <w:rPr>
+          <w:rFonts w:ascii="Times New Roman" w:eastAsia="Times New Roman" w:hAnsi="Times New Roman" w:cs="Times New Roman"/>
+          <w:sz w:val="22"/>
+          <w:szCs w:val="22"/>
+        </w:rPr>
+        <w:t>How much personal or private information does the commenter disclose about themselves?</w:t>
+      </w:r>
+    </w:p>
+    <w:tbl>
+      <w:tblPr>
+        <w:tblW w:w="9026" w:type="dxa"/>
+        <w:tblBorders>
+          <w:top w:val="single" w:sz="4" w:space="0" w:color="auto"/>
+          <w:left w:val="single" w:sz="4" w:space="0" w:color="auto"/>
+          <w:bottom w:val="single" w:sz="4" w:space="0" w:color="auto"/>
+          <w:right w:val="single" w:sz="4" w:space="0" w:color="auto"/>
+          <w:insideH w:val="single" w:sz="4" w:space="0" w:color="auto"/>
+          <w:insideV w:val="single" w:sz="4" w:space="0" w:color="auto"/>
+        </w:tblBorders>
+        <w:tblCellMar>
+          <w:left w:w="10" w:type="dxa"/>
+          <w:right w:w="10" w:type="dxa"/>
+        </w:tblCellMar>
+        <w:tblLook w:val="04A0" w:firstRow="1" w:lastRow="0" w:firstColumn="1" w:lastColumn="0" w:noHBand="0" w:noVBand="1"/>
+      </w:tblPr>
+      <w:tblGrid>
+        <w:gridCol w:w="729"/>
+        <w:gridCol w:w="1389"/>
+        <w:gridCol w:w="3447"/>
+        <w:gridCol w:w="3461"/>
+      </w:tblGrid>
+      <w:tr>
+        <w:tc>
+          <w:tcPr>
+            <w:tcW w:w="700" w:type="dxa"/>
+            <w:tcBorders>
+              <w:top w:val="single" w:sz="4" w:space="0" w:color="000000"/>
+              <w:left w:val="single" w:sz="4" w:space="0" w:color="000000"/>
+              <w:bottom w:val="single" w:sz="4" w:space="0" w:color="000000"/>
+              <w:right w:val="single" w:sz="4" w:space="0" w:color="000000"/>
+            </w:tcBorders>
+            <w:shd w:val="clear" w:color="auto" w:fill="D9D9D9"/>
+            <w:tcMar>
+              <w:top w:w="80" w:type="dxa"/>
+              <w:left w:w="120" w:type="dxa"/>
+              <w:bottom w:w="80" w:type="dxa"/>
+              <w:right w:w="120" w:type="dxa"/>
+            </w:tcMar>
+          </w:tcPr>
+          <w:p>
+            <w:pPr>
+              <w:rPr>
+                <w:rFonts w:ascii="Times New Roman" w:hAnsi="Times New Roman" w:cs="Times New Roman"/>
+                <w:sz w:val="22"/>
+                <w:szCs w:val="22"/>
+              </w:rPr>
+            </w:pPr>
+            <w:r>
+              <w:rPr>
+                <w:rFonts w:ascii="Times New Roman" w:eastAsia="Times New Roman" w:hAnsi="Times New Roman" w:cs="Times New Roman"/>
+                <w:b/>
+                <w:bCs/>
+                <w:sz w:val="22"/>
+                <w:szCs w:val="22"/>
+              </w:rPr>
+              <w:lastRenderedPageBreak/>
+              <w:t>Code</w:t>
+            </w:r>
+          </w:p>
+        </w:tc>
+        <w:tc>
+          <w:tcPr>
+            <w:tcW w:w="1200" w:type="dxa"/>
+            <w:tcBorders>
+              <w:top w:val="single" w:sz="4" w:space="0" w:color="000000"/>
+              <w:left w:val="single" w:sz="4" w:space="0" w:color="000000"/>
+              <w:bottom w:val="single" w:sz="4" w:space="0" w:color="000000"/>
+              <w:right w:val="single" w:sz="4" w:space="0" w:color="000000"/>
+            </w:tcBorders>
+            <w:shd w:val="clear" w:color="auto" w:fill="D9D9D9"/>
+            <w:tcMar>
+              <w:top w:w="80" w:type="dxa"/>
+              <w:left w:w="120" w:type="dxa"/>
+              <w:bottom w:w="80" w:type="dxa"/>
+              <w:right w:w="120" w:type="dxa"/>
+            </w:tcMar>
+          </w:tcPr>
+          <w:p>
+            <w:pPr>
+              <w:rPr>
+                <w:rFonts w:ascii="Times New Roman" w:hAnsi="Times New Roman" w:cs="Times New Roman"/>
+                <w:sz w:val="22"/>
+                <w:szCs w:val="22"/>
+              </w:rPr>
+            </w:pPr>
+            <w:r>
+              <w:rPr>
+                <w:rFonts w:ascii="Times New Roman" w:eastAsia="Times New Roman" w:hAnsi="Times New Roman" w:cs="Times New Roman"/>
+                <w:b/>
+                <w:bCs/>
+                <w:sz w:val="22"/>
+                <w:szCs w:val="22"/>
+              </w:rPr>
+              <w:t>Label</w:t>
+            </w:r>
+          </w:p>
+        </w:tc>
+        <w:tc>
+          <w:tcPr>
+            <w:tcW w:w="3563" w:type="dxa"/>
+            <w:tcBorders>
+              <w:top w:val="single" w:sz="4" w:space="0" w:color="000000"/>
+              <w:left w:val="single" w:sz="4" w:space="0" w:color="000000"/>
+              <w:bottom w:val="single" w:sz="4" w:space="0" w:color="000000"/>
+              <w:right w:val="single" w:sz="4" w:space="0" w:color="000000"/>
+            </w:tcBorders>
+            <w:shd w:val="clear" w:color="auto" w:fill="D9D9D9"/>
+            <w:tcMar>
+              <w:top w:w="80" w:type="dxa"/>
+              <w:left w:w="120" w:type="dxa"/>
+              <w:bottom w:w="80" w:type="dxa"/>
+              <w:right w:w="120" w:type="dxa"/>
+            </w:tcMar>
+          </w:tcPr>
+          <w:p>
+            <w:pPr>
+              <w:rPr>
+                <w:rFonts w:ascii="Times New Roman" w:hAnsi="Times New Roman" w:cs="Times New Roman"/>
+                <w:sz w:val="22"/>
+                <w:szCs w:val="22"/>
+              </w:rPr>
+            </w:pPr>
+            <w:r>
+              <w:rPr>
+                <w:rFonts w:ascii="Times New Roman" w:eastAsia="Times New Roman" w:hAnsi="Times New Roman" w:cs="Times New Roman"/>
+                <w:b/>
+                <w:bCs/>
+                <w:sz w:val="22"/>
+                <w:szCs w:val="22"/>
+              </w:rPr>
+              <w:t>Definition</w:t>
+            </w:r>
+          </w:p>
+        </w:tc>
+        <w:tc>
+          <w:tcPr>
+            <w:tcW w:w="3563" w:type="dxa"/>
+            <w:tcBorders>
+              <w:top w:val="single" w:sz="4" w:space="0" w:color="000000"/>
+              <w:left w:val="single" w:sz="4" w:space="0" w:color="000000"/>
+              <w:bottom w:val="single" w:sz="4" w:space="0" w:color="000000"/>
+              <w:right w:val="single" w:sz="4" w:space="0" w:color="000000"/>
+            </w:tcBorders>
+            <w:shd w:val="clear" w:color="auto" w:fill="D9D9D9"/>
+            <w:tcMar>
+              <w:top w:w="80" w:type="dxa"/>
+              <w:left w:w="120" w:type="dxa"/>
+              <w:bottom w:w="80" w:type="dxa"/>
+              <w:right w:w="120" w:type="dxa"/>
+            </w:tcMar>
+          </w:tcPr>
+          <w:p>
+            <w:pPr>
+              <w:rPr>
+                <w:rFonts w:ascii="Times New Roman" w:hAnsi="Times New Roman" w:cs="Times New Roman"/>
+                <w:sz w:val="22"/>
+                <w:szCs w:val="22"/>
+              </w:rPr>
+            </w:pPr>
+            <w:r>
+              <w:rPr>
+                <w:rFonts w:ascii="Times New Roman" w:eastAsia="Times New Roman" w:hAnsi="Times New Roman" w:cs="Times New Roman"/>
+                <w:b/>
+                <w:bCs/>
+                <w:sz w:val="22"/>
+                <w:szCs w:val="22"/>
+              </w:rPr>
+              <w:t>Examples</w:t>
+            </w:r>
+          </w:p>
+        </w:tc>
+      </w:tr>
+      <w:tr>
+        <w:tc>
+          <w:tcPr>
+            <w:tcW w:w="700" w:type="dxa"/>
+            <w:tcBorders>
+              <w:top w:val="single" w:sz="1" w:space="0" w:color="CCCCCC"/>
+              <w:left w:val="single" w:sz="1" w:space="0" w:color="CCCCCC"/>
+              <w:bottom w:val="single" w:sz="1" w:space="0" w:color="CCCCCC"/>
+              <w:right w:val="single" w:sz="1" w:space="0" w:color="CCCCCC"/>
+            </w:tcBorders>
+            <w:shd w:val="clear" w:color="auto" w:fill="E8E8E8" w:themeFill="background2"/>
+            <w:tcMar>
+              <w:top w:w="80" w:type="dxa"/>
+              <w:left w:w="120" w:type="dxa"/>
+              <w:bottom w:w="80" w:type="dxa"/>
+              <w:right w:w="120" w:type="dxa"/>
+            </w:tcMar>
+          </w:tcPr>
+          <w:p>
+            <w:pPr>
+              <w:rPr>
+                <w:rFonts w:ascii="Times New Roman" w:hAnsi="Times New Roman" w:cs="Times New Roman"/>
+                <w:sz w:val="22"/>
+                <w:szCs w:val="22"/>
+              </w:rPr>
+            </w:pPr>
+            <w:r>
+              <w:rPr>
+                <w:rFonts w:ascii="Times New Roman" w:eastAsia="Times New Roman" w:hAnsi="Times New Roman" w:cs="Times New Roman"/>
+                <w:sz w:val="22"/>
+                <w:szCs w:val="22"/>
+              </w:rPr>
+              <w:t>1</w:t>
+            </w:r>
+          </w:p>
+        </w:tc>
+        <w:tc>
+          <w:tcPr>
+            <w:tcW w:w="1200" w:type="dxa"/>
+            <w:tcBorders>
+              <w:top w:val="single" w:sz="1" w:space="0" w:color="CCCCCC"/>
+              <w:left w:val="single" w:sz="1" w:space="0" w:color="CCCCCC"/>
+              <w:bottom w:val="single" w:sz="1" w:space="0" w:color="CCCCCC"/>
+              <w:right w:val="single" w:sz="1" w:space="0" w:color="CCCCCC"/>
+            </w:tcBorders>
+            <w:shd w:val="clear" w:color="auto" w:fill="E8E8E8" w:themeFill="background2"/>
+            <w:tcMar>
+              <w:top w:w="80" w:type="dxa"/>
+              <w:left w:w="120" w:type="dxa"/>
+              <w:bottom w:w="80" w:type="dxa"/>
+              <w:right w:w="120" w:type="dxa"/>
+            </w:tcMar>
+          </w:tcPr>
+          <w:p>
+            <w:pPr>
+              <w:rPr>
+                <w:rFonts w:ascii="Times New Roman" w:hAnsi="Times New Roman" w:cs="Times New Roman"/>
+                <w:sz w:val="22"/>
+                <w:szCs w:val="22"/>
+              </w:rPr>
+            </w:pPr>
+            <w:r>
+              <w:rPr>
+                <w:rFonts w:ascii="Times New Roman" w:eastAsia="Times New Roman" w:hAnsi="Times New Roman" w:cs="Times New Roman"/>
+                <w:sz w:val="22"/>
+                <w:szCs w:val="22"/>
+              </w:rPr>
+              <w:t>High</w:t>
+            </w:r>
+            <w:r>
+              <w:rPr>
+                <w:rFonts w:ascii="Times New Roman" w:hAnsi="Times New Roman" w:cs="Times New Roman"/>
+                <w:sz w:val="22"/>
+                <w:szCs w:val="22"/>
+              </w:rPr>
+              <w:t xml:space="preserve"> </w:t>
+            </w:r>
+            <w:r>
+              <w:rPr>
+                <w:rFonts w:ascii="Times New Roman" w:hAnsi="Times New Roman" w:cs="Times New Roman"/>
+                <w:sz w:val="22"/>
+                <w:szCs w:val="22"/>
+              </w:rPr>
+              <w:t>controversy</w:t>
+            </w:r>
+          </w:p>
+        </w:tc>
+        <w:tc>
+          <w:tcPr>
+            <w:tcW w:w="3563" w:type="dxa"/>
+            <w:tcBorders>
+              <w:top w:val="single" w:sz="1" w:space="0" w:color="CCCCCC"/>
+              <w:left w:val="single" w:sz="1" w:space="0" w:color="CCCCCC"/>
+              <w:bottom w:val="single" w:sz="1" w:space="0" w:color="CCCCCC"/>
+              <w:right w:val="single" w:sz="1" w:space="0" w:color="CCCCCC"/>
+            </w:tcBorders>
+            <w:shd w:val="clear" w:color="auto" w:fill="E8E8E8" w:themeFill="background2"/>
+            <w:tcMar>
+              <w:top w:w="80" w:type="dxa"/>
+              <w:left w:w="120" w:type="dxa"/>
+              <w:bottom w:w="80" w:type="dxa"/>
+              <w:right w:w="120" w:type="dxa"/>
+            </w:tcMar>
+          </w:tcPr>
+          <w:p>
+            <w:pPr>
+              <w:rPr>
+                <w:rFonts w:ascii="Times New Roman" w:hAnsi="Times New Roman" w:cs="Times New Roman"/>
+                <w:sz w:val="22"/>
+                <w:szCs w:val="22"/>
+              </w:rPr>
+            </w:pPr>
+            <w:r>
+              <w:rPr>
+                <w:rFonts w:ascii="Times New Roman" w:eastAsia="Times New Roman" w:hAnsi="Times New Roman" w:cs="Times New Roman"/>
+                <w:sz w:val="22"/>
+                <w:szCs w:val="22"/>
+              </w:rPr>
+              <w:t>Comment touches upon highly divisive political or social topics likely to provoke strong disagreement, such as immigration, religion, ethnicity, or radical political positions.</w:t>
+            </w:r>
+          </w:p>
+        </w:tc>
+        <w:tc>
+          <w:tcPr>
+            <w:tcW w:w="3563" w:type="dxa"/>
+            <w:tcBorders>
+              <w:top w:val="single" w:sz="1" w:space="0" w:color="CCCCCC"/>
+              <w:left w:val="single" w:sz="1" w:space="0" w:color="CCCCCC"/>
+              <w:bottom w:val="single" w:sz="1" w:space="0" w:color="CCCCCC"/>
+              <w:right w:val="single" w:sz="1" w:space="0" w:color="CCCCCC"/>
+            </w:tcBorders>
+            <w:shd w:val="clear" w:color="auto" w:fill="E8E8E8" w:themeFill="background2"/>
+            <w:tcMar>
+              <w:top w:w="80" w:type="dxa"/>
+              <w:left w:w="120" w:type="dxa"/>
+              <w:bottom w:w="80" w:type="dxa"/>
+              <w:right w:w="120" w:type="dxa"/>
+            </w:tcMar>
+          </w:tcPr>
+          <w:p>
+            <w:pPr>
+              <w:pStyle w:val="ListParagraph"/>
+              <w:numPr>
+                <w:ilvl w:val="0"/>
+                <w:numId w:val="1"/>
+              </w:numPr>
+              <w:spacing w:after="0" w:line="240" w:lineRule="auto"/>
+              <w:contextualSpacing w:val="0"/>
+              <w:rPr>
+                <w:rFonts w:ascii="Times New Roman" w:hAnsi="Times New Roman" w:cs="Times New Roman"/>
+                <w:sz w:val="22"/>
+                <w:szCs w:val="22"/>
+              </w:rPr>
+            </w:pPr>
+            <w:r>
+              <w:rPr>
+                <w:rFonts w:ascii="Times New Roman" w:eastAsia="Times New Roman" w:hAnsi="Times New Roman" w:cs="Times New Roman"/>
+                <w:sz w:val="22"/>
+                <w:szCs w:val="22"/>
+              </w:rPr>
+              <w:t>"I agree with the 9-point plan... Why not stop the intake of asylum seekers. That saves a lot of costs."</w:t>
+            </w:r>
+          </w:p>
+          <w:p>
+            <w:pPr>
+              <w:pStyle w:val="ListParagraph"/>
+              <w:numPr>
+                <w:ilvl w:val="0"/>
+                <w:numId w:val="1"/>
+              </w:numPr>
+              <w:spacing w:after="0" w:line="240" w:lineRule="auto"/>
+              <w:contextualSpacing w:val="0"/>
+              <w:rPr>
+                <w:rFonts w:ascii="Times New Roman" w:hAnsi="Times New Roman" w:cs="Times New Roman"/>
+                <w:sz w:val="22"/>
+                <w:szCs w:val="22"/>
+              </w:rPr>
+            </w:pPr>
+            <w:r>
+              <w:rPr>
+                <w:rFonts w:ascii="Times New Roman" w:eastAsia="Times New Roman" w:hAnsi="Times New Roman" w:cs="Times New Roman"/>
+                <w:sz w:val="22"/>
+                <w:szCs w:val="22"/>
+              </w:rPr>
+              <w:t>"The points are fine, but it needs to be clarified how people radicalize and become terrorists."</w:t>
+            </w:r>
+            <w:r>
+              <w:t xml:space="preserve"> </w:t>
+            </w:r>
+          </w:p>
+          <w:p>
+            <w:pPr>
+              <w:pStyle w:val="ListParagraph"/>
+              <w:numPr>
+                <w:ilvl w:val="0"/>
+                <w:numId w:val="1"/>
+              </w:numPr>
+              <w:spacing w:after="0" w:line="240" w:lineRule="auto"/>
+              <w:contextualSpacing w:val="0"/>
+              <w:rPr>
+                <w:rFonts w:ascii="Times New Roman" w:hAnsi="Times New Roman" w:cs="Times New Roman"/>
+                <w:sz w:val="22"/>
+                <w:szCs w:val="22"/>
+              </w:rPr>
+            </w:pPr>
+            <w:r>
+              <w:rPr>
+                <w:rFonts w:ascii="Times New Roman" w:eastAsia="Times New Roman" w:hAnsi="Times New Roman" w:cs="Times New Roman"/>
+                <w:sz w:val="22"/>
+                <w:szCs w:val="22"/>
+              </w:rPr>
+              <w:t>"The deportation of refugees must be intensified... It cannot be that refugees bring their relatives to Germany."</w:t>
+            </w:r>
+          </w:p>
+        </w:tc>
+      </w:tr>
+      <w:tr>
+        <w:tc>
+          <w:tcPr>
+            <w:tcW w:w="700" w:type="dxa"/>
+            <w:tcBorders>
+              <w:top w:val="single" w:sz="1" w:space="0" w:color="CCCCCC"/>
+              <w:left w:val="single" w:sz="1" w:space="0" w:color="CCCCCC"/>
+              <w:bottom w:val="single" w:sz="1" w:space="0" w:color="CCCCCC"/>
+              <w:right w:val="single" w:sz="1" w:space="0" w:color="CCCCCC"/>
+            </w:tcBorders>
+            <w:tcMar>
+              <w:top w:w="80" w:type="dxa"/>
+              <w:left w:w="120" w:type="dxa"/>
+              <w:bottom w:w="80" w:type="dxa"/>
+              <w:right w:w="120" w:type="dxa"/>
+            </w:tcMar>
+          </w:tcPr>
+          <w:p>
+            <w:pPr>
+              <w:rPr>
+                <w:rFonts w:ascii="Times New Roman" w:hAnsi="Times New Roman" w:cs="Times New Roman"/>
+                <w:sz w:val="22"/>
+                <w:szCs w:val="22"/>
+              </w:rPr>
+            </w:pPr>
+            <w:r>
+              <w:rPr>
+                <w:rFonts w:ascii="Times New Roman" w:eastAsia="Times New Roman" w:hAnsi="Times New Roman" w:cs="Times New Roman"/>
+                <w:sz w:val="22"/>
+                <w:szCs w:val="22"/>
+              </w:rPr>
+              <w:t>2</w:t>
+            </w:r>
+          </w:p>
+        </w:tc>
+        <w:tc>
+          <w:tcPr>
+            <w:tcW w:w="1200" w:type="dxa"/>
+            <w:tcBorders>
+              <w:top w:val="single" w:sz="1" w:space="0" w:color="CCCCCC"/>
+              <w:left w:val="single" w:sz="1" w:space="0" w:color="CCCCCC"/>
+              <w:bottom w:val="single" w:sz="1" w:space="0" w:color="CCCCCC"/>
+              <w:right w:val="single" w:sz="1" w:space="0" w:color="CCCCCC"/>
+            </w:tcBorders>
+            <w:tcMar>
+              <w:top w:w="80" w:type="dxa"/>
+              <w:left w:w="120" w:type="dxa"/>
+              <w:bottom w:w="80" w:type="dxa"/>
+              <w:right w:w="120" w:type="dxa"/>
+            </w:tcMar>
+          </w:tcPr>
+          <w:p>
+            <w:pPr>
+              <w:rPr>
+                <w:rFonts w:ascii="Times New Roman" w:hAnsi="Times New Roman" w:cs="Times New Roman"/>
+                <w:sz w:val="22"/>
+                <w:szCs w:val="22"/>
+              </w:rPr>
+            </w:pPr>
+            <w:r>
+              <w:rPr>
+                <w:rFonts w:ascii="Times New Roman" w:eastAsia="Times New Roman" w:hAnsi="Times New Roman" w:cs="Times New Roman"/>
+                <w:sz w:val="22"/>
+                <w:szCs w:val="22"/>
+              </w:rPr>
+              <w:t>Moderate</w:t>
+            </w:r>
+            <w:r>
+              <w:rPr>
+                <w:rFonts w:ascii="Times New Roman" w:hAnsi="Times New Roman" w:cs="Times New Roman"/>
+                <w:sz w:val="22"/>
+                <w:szCs w:val="22"/>
+              </w:rPr>
+              <w:t xml:space="preserve"> </w:t>
+            </w:r>
+            <w:r>
+              <w:rPr>
+                <w:rFonts w:ascii="Times New Roman" w:hAnsi="Times New Roman" w:cs="Times New Roman"/>
+                <w:sz w:val="22"/>
+                <w:szCs w:val="22"/>
+              </w:rPr>
+              <w:t>controver</w:t>
+            </w:r>
+            <w:r>
+              <w:rPr>
+                <w:rFonts w:ascii="Times New Roman" w:hAnsi="Times New Roman" w:cs="Times New Roman"/>
+                <w:sz w:val="22"/>
+                <w:szCs w:val="22"/>
+              </w:rPr>
+              <w:t>s</w:t>
+            </w:r>
+            <w:r>
+              <w:rPr>
+                <w:rFonts w:ascii="Times New Roman" w:hAnsi="Times New Roman" w:cs="Times New Roman"/>
+                <w:sz w:val="22"/>
+                <w:szCs w:val="22"/>
+              </w:rPr>
+              <w:t>y</w:t>
+            </w:r>
+          </w:p>
+        </w:tc>
+        <w:tc>
+          <w:tcPr>
+            <w:tcW w:w="3563" w:type="dxa"/>
+            <w:tcBorders>
+              <w:top w:val="single" w:sz="1" w:space="0" w:color="CCCCCC"/>
+              <w:left w:val="single" w:sz="1" w:space="0" w:color="CCCCCC"/>
+              <w:bottom w:val="single" w:sz="1" w:space="0" w:color="CCCCCC"/>
+              <w:right w:val="single" w:sz="1" w:space="0" w:color="CCCCCC"/>
+            </w:tcBorders>
+            <w:tcMar>
+              <w:top w:w="80" w:type="dxa"/>
+              <w:left w:w="120" w:type="dxa"/>
+              <w:bottom w:w="80" w:type="dxa"/>
+              <w:right w:w="120" w:type="dxa"/>
+            </w:tcMar>
+          </w:tcPr>
+          <w:p>
+            <w:pPr>
+              <w:rPr>
+                <w:rFonts w:ascii="Times New Roman" w:hAnsi="Times New Roman" w:cs="Times New Roman"/>
+                <w:sz w:val="22"/>
+                <w:szCs w:val="22"/>
+              </w:rPr>
+            </w:pPr>
+            <w:r>
+              <w:rPr>
+                <w:rFonts w:ascii="Times New Roman" w:eastAsia="Times New Roman" w:hAnsi="Times New Roman" w:cs="Times New Roman"/>
+                <w:sz w:val="22"/>
+                <w:szCs w:val="22"/>
+              </w:rPr>
+              <w:t xml:space="preserve">Comment expresses a critical or opinionated stance that may provoke </w:t>
+            </w:r>
+            <w:r>
+              <w:rPr>
+                <w:rFonts w:ascii="Times New Roman" w:eastAsia="Times New Roman" w:hAnsi="Times New Roman" w:cs="Times New Roman"/>
+                <w:sz w:val="22"/>
+                <w:szCs w:val="22"/>
+              </w:rPr>
+              <w:t>disagreement but</w:t>
+            </w:r>
+            <w:r>
+              <w:rPr>
+                <w:rFonts w:ascii="Times New Roman" w:eastAsia="Times New Roman" w:hAnsi="Times New Roman" w:cs="Times New Roman"/>
+                <w:sz w:val="22"/>
+                <w:szCs w:val="22"/>
+              </w:rPr>
+              <w:t xml:space="preserve"> does not touch upon highly sensitive social divisions. Includes criticism of politicians or policy without invoking divisive group identities.</w:t>
+            </w:r>
+          </w:p>
+        </w:tc>
+        <w:tc>
+          <w:tcPr>
+            <w:tcW w:w="3563" w:type="dxa"/>
+            <w:tcBorders>
+              <w:top w:val="single" w:sz="1" w:space="0" w:color="CCCCCC"/>
+              <w:left w:val="single" w:sz="1" w:space="0" w:color="CCCCCC"/>
+              <w:bottom w:val="single" w:sz="1" w:space="0" w:color="CCCCCC"/>
+              <w:right w:val="single" w:sz="1" w:space="0" w:color="CCCCCC"/>
+            </w:tcBorders>
+            <w:tcMar>
+              <w:top w:w="80" w:type="dxa"/>
+              <w:left w:w="120" w:type="dxa"/>
+              <w:bottom w:w="80" w:type="dxa"/>
+              <w:right w:w="120" w:type="dxa"/>
+            </w:tcMar>
+          </w:tcPr>
+          <w:p>
+            <w:pPr>
+              <w:pStyle w:val="ListParagraph"/>
+              <w:numPr>
+                <w:ilvl w:val="0"/>
+                <w:numId w:val="1"/>
+              </w:numPr>
+              <w:spacing w:after="0" w:line="240" w:lineRule="auto"/>
+              <w:contextualSpacing w:val="0"/>
+              <w:rPr>
+                <w:rFonts w:ascii="Times New Roman" w:hAnsi="Times New Roman" w:cs="Times New Roman"/>
+                <w:sz w:val="22"/>
+                <w:szCs w:val="22"/>
+              </w:rPr>
+            </w:pPr>
+            <w:r>
+              <w:rPr>
+                <w:rFonts w:ascii="Times New Roman" w:eastAsia="Times New Roman" w:hAnsi="Times New Roman" w:cs="Times New Roman"/>
+                <w:sz w:val="22"/>
+                <w:szCs w:val="22"/>
+              </w:rPr>
+              <w:t>"Hot air, like everything that comes from Merkel."</w:t>
+            </w:r>
+            <w:r>
+              <w:t xml:space="preserve"> </w:t>
+            </w:r>
+          </w:p>
+          <w:p>
+            <w:pPr>
+              <w:pStyle w:val="ListParagraph"/>
+              <w:numPr>
+                <w:ilvl w:val="0"/>
+                <w:numId w:val="1"/>
+              </w:numPr>
+              <w:spacing w:after="0" w:line="240" w:lineRule="auto"/>
+              <w:contextualSpacing w:val="0"/>
+              <w:rPr>
+                <w:rFonts w:ascii="Times New Roman" w:hAnsi="Times New Roman" w:cs="Times New Roman"/>
+                <w:sz w:val="22"/>
+                <w:szCs w:val="22"/>
+              </w:rPr>
+            </w:pPr>
+            <w:r>
+              <w:rPr>
+                <w:rFonts w:ascii="Times New Roman" w:eastAsia="Times New Roman" w:hAnsi="Times New Roman" w:cs="Times New Roman"/>
+                <w:sz w:val="22"/>
+                <w:szCs w:val="22"/>
+              </w:rPr>
+              <w:t>"How much of this is just election campaign noise?"</w:t>
+            </w:r>
+          </w:p>
+          <w:p>
+            <w:pPr>
+              <w:pStyle w:val="ListParagraph"/>
+              <w:numPr>
+                <w:ilvl w:val="0"/>
+                <w:numId w:val="1"/>
+              </w:numPr>
+              <w:spacing w:after="0" w:line="240" w:lineRule="auto"/>
+              <w:contextualSpacing w:val="0"/>
+              <w:rPr>
+                <w:rFonts w:ascii="Times New Roman" w:hAnsi="Times New Roman" w:cs="Times New Roman"/>
+                <w:sz w:val="22"/>
+                <w:szCs w:val="22"/>
+              </w:rPr>
+            </w:pPr>
+            <w:r>
+              <w:rPr>
+                <w:rFonts w:ascii="Times New Roman" w:hAnsi="Times New Roman" w:cs="Times New Roman"/>
+                <w:sz w:val="22"/>
+                <w:szCs w:val="22"/>
+              </w:rPr>
+              <w:t>"Elections are coming... of course big promises are made that are never kept after the vote."</w:t>
+            </w:r>
+          </w:p>
+        </w:tc>
+      </w:tr>
+      <w:tr>
+        <w:tc>
+          <w:tcPr>
+            <w:tcW w:w="700" w:type="dxa"/>
+            <w:tcBorders>
+              <w:top w:val="single" w:sz="1" w:space="0" w:color="CCCCCC"/>
+              <w:left w:val="single" w:sz="1" w:space="0" w:color="CCCCCC"/>
+              <w:bottom w:val="single" w:sz="1" w:space="0" w:color="CCCCCC"/>
+              <w:right w:val="single" w:sz="1" w:space="0" w:color="CCCCCC"/>
+            </w:tcBorders>
+            <w:shd w:val="clear" w:color="auto" w:fill="E8E8E8" w:themeFill="background2"/>
+            <w:tcMar>
+              <w:top w:w="80" w:type="dxa"/>
+              <w:left w:w="120" w:type="dxa"/>
+              <w:bottom w:w="80" w:type="dxa"/>
+              <w:right w:w="120" w:type="dxa"/>
+            </w:tcMar>
+          </w:tcPr>
+          <w:p>
+            <w:pPr>
+              <w:rPr>
+                <w:rFonts w:ascii="Times New Roman" w:hAnsi="Times New Roman" w:cs="Times New Roman"/>
+                <w:sz w:val="22"/>
+                <w:szCs w:val="22"/>
+              </w:rPr>
+            </w:pPr>
+            <w:r>
+              <w:rPr>
+                <w:rFonts w:ascii="Times New Roman" w:eastAsia="Times New Roman" w:hAnsi="Times New Roman" w:cs="Times New Roman"/>
+                <w:sz w:val="22"/>
+                <w:szCs w:val="22"/>
+              </w:rPr>
+              <w:t>3</w:t>
+            </w:r>
+          </w:p>
+        </w:tc>
+        <w:tc>
+          <w:tcPr>
+            <w:tcW w:w="1200" w:type="dxa"/>
+            <w:tcBorders>
+              <w:top w:val="single" w:sz="1" w:space="0" w:color="CCCCCC"/>
+              <w:left w:val="single" w:sz="1" w:space="0" w:color="CCCCCC"/>
+              <w:bottom w:val="single" w:sz="1" w:space="0" w:color="CCCCCC"/>
+              <w:right w:val="single" w:sz="1" w:space="0" w:color="CCCCCC"/>
+            </w:tcBorders>
+            <w:shd w:val="clear" w:color="auto" w:fill="E8E8E8" w:themeFill="background2"/>
+            <w:tcMar>
+              <w:top w:w="80" w:type="dxa"/>
+              <w:left w:w="120" w:type="dxa"/>
+              <w:bottom w:w="80" w:type="dxa"/>
+              <w:right w:w="120" w:type="dxa"/>
+            </w:tcMar>
+          </w:tcPr>
+          <w:p>
+            <w:pPr>
+              <w:rPr>
+                <w:rFonts w:ascii="Times New Roman" w:hAnsi="Times New Roman" w:cs="Times New Roman"/>
+                <w:sz w:val="22"/>
+                <w:szCs w:val="22"/>
+              </w:rPr>
+            </w:pPr>
+            <w:r>
+              <w:rPr>
+                <w:rFonts w:ascii="Times New Roman" w:eastAsia="Times New Roman" w:hAnsi="Times New Roman" w:cs="Times New Roman"/>
+                <w:sz w:val="22"/>
+                <w:szCs w:val="22"/>
+              </w:rPr>
+              <w:t xml:space="preserve">Not </w:t>
+            </w:r>
+            <w:r>
+              <w:rPr>
+                <w:rFonts w:ascii="Times New Roman" w:eastAsia="Times New Roman" w:hAnsi="Times New Roman" w:cs="Times New Roman"/>
+                <w:sz w:val="22"/>
+                <w:szCs w:val="22"/>
+              </w:rPr>
+              <w:t>controversial</w:t>
+            </w:r>
+          </w:p>
+        </w:tc>
+        <w:tc>
+          <w:tcPr>
+            <w:tcW w:w="3563" w:type="dxa"/>
+            <w:tcBorders>
+              <w:top w:val="single" w:sz="1" w:space="0" w:color="CCCCCC"/>
+              <w:left w:val="single" w:sz="1" w:space="0" w:color="CCCCCC"/>
+              <w:bottom w:val="single" w:sz="1" w:space="0" w:color="CCCCCC"/>
+              <w:right w:val="single" w:sz="1" w:space="0" w:color="CCCCCC"/>
+            </w:tcBorders>
+            <w:shd w:val="clear" w:color="auto" w:fill="E8E8E8" w:themeFill="background2"/>
+            <w:tcMar>
+              <w:top w:w="80" w:type="dxa"/>
+              <w:left w:w="120" w:type="dxa"/>
+              <w:bottom w:w="80" w:type="dxa"/>
+              <w:right w:w="120" w:type="dxa"/>
+            </w:tcMar>
+          </w:tcPr>
+          <w:p>
+            <w:pPr>
+              <w:rPr>
+                <w:rFonts w:ascii="Times New Roman" w:hAnsi="Times New Roman" w:cs="Times New Roman"/>
+                <w:sz w:val="22"/>
+                <w:szCs w:val="22"/>
+              </w:rPr>
+            </w:pPr>
+            <w:r>
+              <w:rPr>
+                <w:rFonts w:ascii="Times New Roman" w:eastAsia="Times New Roman" w:hAnsi="Times New Roman" w:cs="Times New Roman"/>
+                <w:sz w:val="22"/>
+                <w:szCs w:val="22"/>
+              </w:rPr>
+              <w:t>Comment is factual, procedural, or broadly consensual. Unlikely to provoke strong disagreement or negative reactions from other users.</w:t>
+            </w:r>
+          </w:p>
+        </w:tc>
+        <w:tc>
+          <w:tcPr>
+            <w:tcW w:w="3563" w:type="dxa"/>
+            <w:tcBorders>
+              <w:top w:val="single" w:sz="1" w:space="0" w:color="CCCCCC"/>
+              <w:left w:val="single" w:sz="1" w:space="0" w:color="CCCCCC"/>
+              <w:bottom w:val="single" w:sz="1" w:space="0" w:color="CCCCCC"/>
+              <w:right w:val="single" w:sz="1" w:space="0" w:color="CCCCCC"/>
+            </w:tcBorders>
+            <w:shd w:val="clear" w:color="auto" w:fill="E8E8E8" w:themeFill="background2"/>
+            <w:tcMar>
+              <w:top w:w="80" w:type="dxa"/>
+              <w:left w:w="120" w:type="dxa"/>
+              <w:bottom w:w="80" w:type="dxa"/>
+              <w:right w:w="120" w:type="dxa"/>
+            </w:tcMar>
+          </w:tcPr>
+          <w:p>
+            <w:pPr>
+              <w:pStyle w:val="ListParagraph"/>
+              <w:numPr>
+                <w:ilvl w:val="0"/>
+                <w:numId w:val="1"/>
+              </w:numPr>
+              <w:spacing w:after="0" w:line="240" w:lineRule="auto"/>
+              <w:contextualSpacing w:val="0"/>
+              <w:rPr>
+                <w:rFonts w:ascii="Times New Roman" w:hAnsi="Times New Roman" w:cs="Times New Roman"/>
+                <w:sz w:val="22"/>
+                <w:szCs w:val="22"/>
+              </w:rPr>
+            </w:pPr>
+            <w:r>
+              <w:rPr>
+                <w:rFonts w:ascii="Times New Roman" w:eastAsia="Times New Roman" w:hAnsi="Times New Roman" w:cs="Times New Roman"/>
+                <w:sz w:val="22"/>
+                <w:szCs w:val="22"/>
+              </w:rPr>
+              <w:t>"Definitely better cooperation between international intelligence services."</w:t>
+            </w:r>
+          </w:p>
+          <w:p>
+            <w:pPr>
+              <w:pStyle w:val="ListParagraph"/>
+              <w:numPr>
+                <w:ilvl w:val="0"/>
+                <w:numId w:val="1"/>
+              </w:numPr>
+              <w:spacing w:after="0" w:line="240" w:lineRule="auto"/>
+              <w:contextualSpacing w:val="0"/>
+              <w:rPr>
+                <w:rFonts w:ascii="Times New Roman" w:hAnsi="Times New Roman" w:cs="Times New Roman"/>
+                <w:sz w:val="22"/>
+                <w:szCs w:val="22"/>
+              </w:rPr>
+            </w:pPr>
+            <w:r>
+              <w:rPr>
+                <w:rFonts w:ascii="Times New Roman" w:eastAsia="Times New Roman" w:hAnsi="Times New Roman" w:cs="Times New Roman"/>
+                <w:sz w:val="22"/>
+                <w:szCs w:val="22"/>
+              </w:rPr>
+              <w:t xml:space="preserve">"Weapons purchases should not only be restricted online." </w:t>
+            </w:r>
+          </w:p>
+          <w:p>
+            <w:pPr>
+              <w:pStyle w:val="ListParagraph"/>
+              <w:numPr>
+                <w:ilvl w:val="0"/>
+                <w:numId w:val="1"/>
+              </w:numPr>
+              <w:spacing w:after="0" w:line="240" w:lineRule="auto"/>
+              <w:contextualSpacing w:val="0"/>
+              <w:rPr>
+                <w:rFonts w:ascii="Times New Roman" w:hAnsi="Times New Roman" w:cs="Times New Roman"/>
+                <w:sz w:val="22"/>
+                <w:szCs w:val="22"/>
+              </w:rPr>
+            </w:pPr>
+            <w:r>
+              <w:rPr>
+                <w:rFonts w:ascii="Times New Roman" w:eastAsia="Times New Roman" w:hAnsi="Times New Roman" w:cs="Times New Roman"/>
+                <w:sz w:val="22"/>
+                <w:szCs w:val="22"/>
+              </w:rPr>
+              <w:t>"It's a start. It remains to be seen how it works in practice."</w:t>
+            </w:r>
+          </w:p>
+        </w:tc>
+      </w:tr>
+    </w:tbl>
+    <w:p>
+      <w:pPr>
+        <w:pBdr>
+          <w:bottom w:val="single" w:sz="6" w:space="1" w:color="auto"/>
+        </w:pBdr>
+        <w:spacing w:before="200" w:after="100"/>
+        <w:rPr>
+          <w:rFonts w:ascii="Times New Roman" w:eastAsia="Times New Roman" w:hAnsi="Times New Roman" w:cs="Times New Roman"/>
+          <w:b/>
+          <w:bCs/>
+          <w:caps/>
+          <w:sz w:val="22"/>
+          <w:szCs w:val="22"/>
         </w:rPr>
       </w:pPr>
     </w:p>
@@ -2612,7 +3610,23 @@
           <w:sz w:val="22"/>
           <w:szCs w:val="22"/>
         </w:rPr>
-        <w:t>Code each comment independently on both dimensions.</w:t>
+        <w:t xml:space="preserve">Code each comment independently on </w:t>
+      </w:r>
+      <w:r>
+        <w:rPr>
+          <w:rFonts w:ascii="Times New Roman" w:eastAsia="Times New Roman" w:hAnsi="Times New Roman" w:cs="Times New Roman"/>
+          <w:sz w:val="22"/>
+          <w:szCs w:val="22"/>
+        </w:rPr>
+        <w:t>all three</w:t>
+      </w:r>
+      <w:r>
+        <w:rPr>
+          <w:rFonts w:ascii="Times New Roman" w:eastAsia="Times New Roman" w:hAnsi="Times New Roman" w:cs="Times New Roman"/>
+          <w:sz w:val="22"/>
+          <w:szCs w:val="22"/>
+        </w:rPr>
+        <w:t xml:space="preserve"> dimensions.</w:t>
       </w:r>
     </w:p>
     <w:p>
@@ -2660,7 +3674,6 @@
           <w:sz w:val="22"/>
           <w:szCs w:val="22"/>
         </w:rPr>
-        <w:lastRenderedPageBreak/>
         <w:t>Short reply comments that only reference or agree with another comment (e.g., „</w:t>
       </w:r>
       <w:proofErr w:type="spellStart"/>
@@ -2715,7 +3728,31 @@
           <w:sz w:val="22"/>
           <w:szCs w:val="22"/>
         </w:rPr>
-        <w:t xml:space="preserve">) should be coded as Indifferent (Valence) and </w:t>
+        <w:t>) should be coded as Indifferent (Valence)</w:t>
+      </w:r>
+      <w:r>
+        <w:rPr>
+          <w:rFonts w:ascii="Times New Roman" w:eastAsia="Times New Roman" w:hAnsi="Times New Roman" w:cs="Times New Roman"/>
+          <w:sz w:val="22"/>
+          <w:szCs w:val="22"/>
+        </w:rPr>
+        <w:t xml:space="preserve">, </w:t>
+      </w:r>
+      <w:r>
+        <w:rPr>
+          <w:rFonts w:ascii="Times New Roman" w:eastAsia="Times New Roman" w:hAnsi="Times New Roman" w:cs="Times New Roman"/>
+          <w:sz w:val="22"/>
+          <w:szCs w:val="22"/>
+        </w:rPr>
+        <w:t>Not sensitive (Sensitivity)</w:t>
+      </w:r>
+      <w:r>
+        <w:rPr>
+          <w:rFonts w:ascii="Times New Roman" w:eastAsia="Times New Roman" w:hAnsi="Times New Roman" w:cs="Times New Roman"/>
+          <w:sz w:val="22"/>
+          <w:szCs w:val="22"/>
+        </w:rPr>
+        <w:t xml:space="preserve"> and </w:t>
       </w:r>
       <w:proofErr w:type="gramStart"/>
       <w:r>
@@ -2733,7 +3770,33 @@
           <w:sz w:val="22"/>
           <w:szCs w:val="22"/>
         </w:rPr>
-        <w:t xml:space="preserve"> sensitive (Sensitivity), unless additional content is present.</w:t>
+        <w:t xml:space="preserve"> </w:t>
+      </w:r>
+      <w:proofErr w:type="spellStart"/>
+      <w:r>
+        <w:rPr>
+          <w:rFonts w:ascii="Times New Roman" w:eastAsia="Times New Roman" w:hAnsi="Times New Roman" w:cs="Times New Roman"/>
+          <w:sz w:val="22"/>
+          <w:szCs w:val="22"/>
+        </w:rPr>
+        <w:t>controlversial</w:t>
+      </w:r>
+      <w:proofErr w:type="spellEnd"/>
+      <w:r>
+        <w:rPr>
+          <w:rFonts w:ascii="Times New Roman" w:eastAsia="Times New Roman" w:hAnsi="Times New Roman" w:cs="Times New Roman"/>
+          <w:sz w:val="22"/>
+          <w:szCs w:val="22"/>
+        </w:rPr>
+        <w:t xml:space="preserve"> (Controversiality) </w:t>
+      </w:r>
+      <w:r>
+        <w:rPr>
+          <w:rFonts w:ascii="Times New Roman" w:eastAsia="Times New Roman" w:hAnsi="Times New Roman" w:cs="Times New Roman"/>
+          <w:sz w:val="22"/>
+          <w:szCs w:val="22"/>
+        </w:rPr>
+        <w:t>unless additional content is present.</w:t>
       </w:r>
     </w:p>
     <w:p>

</xml_diff>